<commit_message>
docs: folha de rosto completa (titulo definitivo, titulacoes e e-mail do orientador) e enxugamento de Resultados e Discussao na versao final do TCC (#61)
Fecha a P-41 voltando o titulo a "habilita" (o manual diz que o titulo dos
Resultados Preliminares e o definitivo), preenche a titulacao do autor e do
orientador e o e-mail do orientador confirmados por ele. Resultados e
Discussao enxugados (Tabela 6 virou frase, tabelas renumeradas), documento
de 25 para 24 paginas. gerar_docx.py ganhou os estilos da folha de rosto
(autores centralizados, enderecos em Arial 9, Resumo em espacamento simples).
</commit_message>
<xml_diff>
--- a/docs/tcc/final/TCC_final.docx
+++ b/docs/tcc/final/TCC_final.docx
@@ -2,18 +2,18 @@
 <file path=word/document.xml><?xml version="1.0" encoding="utf-8"?>
 <w:document xmlns:w="http://schemas.openxmlformats.org/wordprocessingml/2006/main" xmlns:m="http://schemas.openxmlformats.org/officeDocument/2006/math" xmlns:r="http://schemas.openxmlformats.org/officeDocument/2006/relationships" xmlns:o="urn:schemas-microsoft-com:office:office" xmlns:v="urn:schemas-microsoft-com:vml" xmlns:w10="urn:schemas-microsoft-com:office:word" xmlns:a="http://schemas.openxmlformats.org/drawingml/2006/main" xmlns:pic="http://schemas.openxmlformats.org/drawingml/2006/picture" xmlns:wp="http://schemas.openxmlformats.org/drawingml/2006/wordprocessingDrawing">
   <w:body>
-    <w:bookmarkStart w:id="25" w:name="Xed01b04f50f8bd98356b100c8977f4ee9a0d47f"/>
+    <w:bookmarkStart w:id="25" w:name="Xd2e62e693bdbd8fd59008e8a80460d7248e86f7"/>
     <w:p>
       <w:pPr>
         <w:pStyle w:val="Heading1"/>
       </w:pPr>
       <w:r>
-        <w:t xml:space="preserve">Governança integrada viabiliza consulta em linguagem natural sobre ocupação de leitos hospitalares</w:t>
-      </w:r>
-    </w:p>
-    <w:p>
-      <w:pPr>
-        <w:pStyle w:val="FirstParagraph"/>
+        <w:t xml:space="preserve">Governança integrada habilita consulta em linguagem natural sobre ocupação de leitos hospitalares</w:t>
+      </w:r>
+    </w:p>
+    <w:p>
+      <w:pPr>
+        <w:pStyle w:val="Autores"/>
       </w:pPr>
       <w:r>
         <w:t xml:space="preserve">Gabriel Arcenio Rahal Marostica¹*; José Bernardo Neto²</w:t>
@@ -21,23 +21,23 @@
     </w:p>
     <w:p>
       <w:pPr>
-        <w:pStyle w:val="BodyText"/>
-      </w:pPr>
-      <w:r>
-        <w:t xml:space="preserve">¹* [Titulação do autor]. E-mail: arcenio2501@gmail.com</w:t>
-      </w:r>
-    </w:p>
-    <w:p>
-      <w:pPr>
-        <w:pStyle w:val="BodyText"/>
-      </w:pPr>
-      <w:r>
-        <w:t xml:space="preserve">² [Titulação do orientador]. E-mail: [e-mail do orientador]</w:t>
-      </w:r>
-    </w:p>
-    <w:p>
-      <w:pPr>
-        <w:pStyle w:val="BodyText"/>
+        <w:pStyle w:val="Endereco"/>
+      </w:pPr>
+      <w:r>
+        <w:t xml:space="preserve">¹* Bacharel em Design Gráfico, especialista em Machine Learning e Inteligência Artificial. Hospital Sírio-Libanês. E-mail autor correspondente: arcenio2501@gmail.com</w:t>
+      </w:r>
+    </w:p>
+    <w:p>
+      <w:pPr>
+        <w:pStyle w:val="Endereco"/>
+      </w:pPr>
+      <w:r>
+        <w:t xml:space="preserve">² Doutor em Ciências. E-mail: bernardo@ita.br</w:t>
+      </w:r>
+    </w:p>
+    <w:p>
+      <w:pPr>
+        <w:pStyle w:val="Rotulo"/>
       </w:pPr>
       <w:r>
         <w:rPr>
@@ -49,7 +49,7 @@
     </w:p>
     <w:p>
       <w:pPr>
-        <w:pStyle w:val="BodyText"/>
+        <w:pStyle w:val="ResumoTexto"/>
       </w:pPr>
       <w:r>
         <w:t xml:space="preserve">A consulta a dados hospitalares em linguagem natural promete ampliar o</w:t>
@@ -189,7 +189,7 @@
     </w:p>
     <w:p>
       <w:pPr>
-        <w:pStyle w:val="BodyText"/>
+        <w:pStyle w:val="SemRecuo"/>
       </w:pPr>
       <w:r>
         <w:rPr>
@@ -2790,91 +2790,79 @@
         <w:t xml:space="preserve"> </w:t>
       </w:r>
       <w:r>
-        <w:t xml:space="preserve">Com as colunas originais</w:t>
-      </w:r>
-      <w:r>
-        <w:t xml:space="preserve"> </w:t>
-      </w:r>
-      <w:r>
-        <w:t xml:space="preserve">da tabela de internações (unidade, tipo, faixa etária, sexo e data de</w:t>
-      </w:r>
-      <w:r>
-        <w:t xml:space="preserve"> </w:t>
-      </w:r>
-      <w:r>
-        <w:t xml:space="preserve">admissão), 1.763 dos 1.883 grupos de quase-identificadores tinham uma</w:t>
-      </w:r>
-      <w:r>
-        <w:t xml:space="preserve"> </w:t>
-      </w:r>
-      <w:r>
-        <w:t xml:space="preserve">única internação: a tabela, apresentada como agregada, permitia</w:t>
-      </w:r>
-      <w:r>
-        <w:t xml:space="preserve"> </w:t>
-      </w:r>
-      <w:r>
-        <w:t xml:space="preserve">individualizar cada estadia. Após a redução a tipo de leito, faixa</w:t>
-      </w:r>
-      <w:r>
-        <w:t xml:space="preserve"> </w:t>
-      </w:r>
-      <w:r>
-        <w:t xml:space="preserve">etária, situação e tempo de permanência, o k mínimo passou a 29 sobre o</w:t>
-      </w:r>
-      <w:r>
-        <w:t xml:space="preserve"> </w:t>
-      </w:r>
-      <w:r>
-        <w:t xml:space="preserve">par tipo e faixa, acima tanto do limiar de 5 adotado para uso interno</w:t>
-      </w:r>
-      <w:r>
-        <w:t xml:space="preserve"> </w:t>
-      </w:r>
-      <w:r>
-        <w:t xml:space="preserve">controlado (El Emam e Arbuckle, 2013) quanto do limiar de 11 usado em</w:t>
-      </w:r>
-      <w:r>
-        <w:t xml:space="preserve"> </w:t>
-      </w:r>
-      <w:r>
-        <w:t xml:space="preserve">regras de supressão de célula (Tabela 2). O custo de utilidade foi</w:t>
-      </w:r>
-      <w:r>
-        <w:t xml:space="preserve"> </w:t>
-      </w:r>
-      <w:r>
-        <w:t xml:space="preserve">declarado: internações por unidade deixaram de ser respondíveis. Na</w:t>
-      </w:r>
-      <w:r>
-        <w:t xml:space="preserve"> </w:t>
-      </w:r>
-      <w:r>
-        <w:t xml:space="preserve">análise de sensibilidade que acrescenta a situação (em andamento ou</w:t>
-      </w:r>
-      <w:r>
-        <w:t xml:space="preserve"> </w:t>
-      </w:r>
-      <w:r>
-        <w:t xml:space="preserve">encerrada) aos quase-identificadores, o k mínimo cai para 3, com 3,2%</w:t>
-      </w:r>
-      <w:r>
-        <w:t xml:space="preserve"> </w:t>
-      </w:r>
-      <w:r>
-        <w:t xml:space="preserve">das linhas em grupos menores que 11; o controle imposto por teste cobre o</w:t>
-      </w:r>
-      <w:r>
-        <w:t xml:space="preserve"> </w:t>
-      </w:r>
-      <w:r>
-        <w:t xml:space="preserve">conjunto completo, e não esse subconjunto, o que é retomado nas</w:t>
-      </w:r>
-      <w:r>
-        <w:t xml:space="preserve"> </w:t>
-      </w:r>
-      <w:r>
-        <w:t xml:space="preserve">limitações.</w:t>
+        <w:t xml:space="preserve">Com as colunas originais da tabela de internações (unidade, tipo, faixa</w:t>
+      </w:r>
+      <w:r>
+        <w:t xml:space="preserve"> </w:t>
+      </w:r>
+      <w:r>
+        <w:t xml:space="preserve">etária, sexo e data de admissão), 1.763 dos 1.883 grupos de</w:t>
+      </w:r>
+      <w:r>
+        <w:t xml:space="preserve"> </w:t>
+      </w:r>
+      <w:r>
+        <w:t xml:space="preserve">quase-identificadores tinham uma única internação: a tabela, apresentada</w:t>
+      </w:r>
+      <w:r>
+        <w:t xml:space="preserve"> </w:t>
+      </w:r>
+      <w:r>
+        <w:t xml:space="preserve">como agregada, permitia individualizar cada estadia. Após a redução a</w:t>
+      </w:r>
+      <w:r>
+        <w:t xml:space="preserve"> </w:t>
+      </w:r>
+      <w:r>
+        <w:t xml:space="preserve">tipo de leito, faixa etária, situação e tempo de permanência, o k mínimo</w:t>
+      </w:r>
+      <w:r>
+        <w:t xml:space="preserve"> </w:t>
+      </w:r>
+      <w:r>
+        <w:t xml:space="preserve">passou a 29 sobre o par tipo e faixa, acima do limiar de 5 adotado para</w:t>
+      </w:r>
+      <w:r>
+        <w:t xml:space="preserve"> </w:t>
+      </w:r>
+      <w:r>
+        <w:t xml:space="preserve">uso interno controlado (El Emam e Arbuckle, 2013) e do limiar de 11</w:t>
+      </w:r>
+      <w:r>
+        <w:t xml:space="preserve"> </w:t>
+      </w:r>
+      <w:r>
+        <w:t xml:space="preserve">usado em regras de supressão de célula (Tabela 2). O custo de utilidade</w:t>
+      </w:r>
+      <w:r>
+        <w:t xml:space="preserve"> </w:t>
+      </w:r>
+      <w:r>
+        <w:t xml:space="preserve">foi declarado: internações por unidade deixaram de ser respondíveis.</w:t>
+      </w:r>
+      <w:r>
+        <w:t xml:space="preserve"> </w:t>
+      </w:r>
+      <w:r>
+        <w:t xml:space="preserve">Quando a situação (em andamento ou encerrada) entra nos</w:t>
+      </w:r>
+      <w:r>
+        <w:t xml:space="preserve"> </w:t>
+      </w:r>
+      <w:r>
+        <w:t xml:space="preserve">quase-identificadores, o k mínimo cai para 3, com 3,2% das linhas em</w:t>
+      </w:r>
+      <w:r>
+        <w:t xml:space="preserve"> </w:t>
+      </w:r>
+      <w:r>
+        <w:t xml:space="preserve">grupos menores que 11; o controle imposto por teste cobre o conjunto</w:t>
+      </w:r>
+      <w:r>
+        <w:t xml:space="preserve"> </w:t>
+      </w:r>
+      <w:r>
+        <w:t xml:space="preserve">completo, não esse subconjunto, o que é retomado nas limitações.</w:t>
       </w:r>
     </w:p>
     <w:p>
@@ -3089,91 +3077,79 @@
         <w:pStyle w:val="BodyText"/>
       </w:pPr>
       <w:r>
-        <w:t xml:space="preserve">Uma medição semelhante levou à correção do isolamento das camadas</w:t>
-      </w:r>
-      <w:r>
-        <w:t xml:space="preserve"> </w:t>
-      </w:r>
-      <w:r>
-        <w:t xml:space="preserve">internas. Na primeira versão, a garantia de que Bronze e Silver eram inacessíveis</w:t>
-      </w:r>
-      <w:r>
-        <w:t xml:space="preserve"> </w:t>
-      </w:r>
-      <w:r>
-        <w:t xml:space="preserve">dependia só da inspeção textual da consulta, e três consultas hostis</w:t>
-      </w:r>
-      <w:r>
-        <w:t xml:space="preserve"> </w:t>
-      </w:r>
-      <w:r>
-        <w:t xml:space="preserve">aprovadas pelos guardrails devolveram dados internos: uma função de</w:t>
-      </w:r>
-      <w:r>
-        <w:t xml:space="preserve"> </w:t>
-      </w:r>
-      <w:r>
-        <w:t xml:space="preserve">tabela que recebe o nome da tabela como texto, uma consulta ao catálogo</w:t>
-      </w:r>
-      <w:r>
-        <w:t xml:space="preserve"> </w:t>
-      </w:r>
-      <w:r>
-        <w:t xml:space="preserve">que revelou a coluna de CPF e uma listagem das tabelas internas. A</w:t>
-      </w:r>
-      <w:r>
-        <w:t xml:space="preserve"> </w:t>
-      </w:r>
-      <w:r>
-        <w:t xml:space="preserve">correção adotou duas barreiras independentes: a Gold passou a ser</w:t>
-      </w:r>
-      <w:r>
-        <w:t xml:space="preserve"> </w:t>
-      </w:r>
-      <w:r>
-        <w:t xml:space="preserve">exportada para um arquivo próprio, o único que o sistema abre, e as</w:t>
-      </w:r>
-      <w:r>
-        <w:t xml:space="preserve"> </w:t>
-      </w:r>
-      <w:r>
-        <w:t xml:space="preserve">funções de tabela e de catálogo passaram a ser bloqueadas. O achado</w:t>
-      </w:r>
-      <w:r>
-        <w:t xml:space="preserve"> </w:t>
-      </w:r>
-      <w:r>
-        <w:t xml:space="preserve">reproduz, no protótipo, o que a literatura recente afirma: restrições</w:t>
-      </w:r>
-      <w:r>
-        <w:t xml:space="preserve"> </w:t>
-      </w:r>
-      <w:r>
-        <w:t xml:space="preserve">expressas apenas sobre o texto, no prompt ou por inspeção da consulta,</w:t>
-      </w:r>
-      <w:r>
-        <w:t xml:space="preserve"> </w:t>
-      </w:r>
-      <w:r>
-        <w:t xml:space="preserve">não garantem isolamento, e a garantia precisa ser imposta de forma</w:t>
-      </w:r>
-      <w:r>
-        <w:t xml:space="preserve"> </w:t>
-      </w:r>
-      <w:r>
-        <w:t xml:space="preserve">determinista fora do texto (Fei et al., 2026; Klisura et al., 2026;</w:t>
-      </w:r>
-      <w:r>
-        <w:t xml:space="preserve"> </w:t>
-      </w:r>
-      <w:r>
-        <w:t xml:space="preserve">Miyamoto et al., 2026). A conexão de consulta recebeu ainda, na Etapa E,</w:t>
-      </w:r>
-      <w:r>
-        <w:t xml:space="preserve"> </w:t>
-      </w:r>
-      <w:r>
-        <w:t xml:space="preserve">o bloqueio de acesso a arquivos externos, pelo motivo relatado adiante.</w:t>
+        <w:t xml:space="preserve">Uma medição semelhante corrigiu o isolamento das camadas internas. Na</w:t>
+      </w:r>
+      <w:r>
+        <w:t xml:space="preserve"> </w:t>
+      </w:r>
+      <w:r>
+        <w:t xml:space="preserve">primeira versão, a inacessibilidade de Bronze e Silver dependia só da</w:t>
+      </w:r>
+      <w:r>
+        <w:t xml:space="preserve"> </w:t>
+      </w:r>
+      <w:r>
+        <w:t xml:space="preserve">inspeção textual da consulta, e três consultas hostis aprovadas pelos</w:t>
+      </w:r>
+      <w:r>
+        <w:t xml:space="preserve"> </w:t>
+      </w:r>
+      <w:r>
+        <w:t xml:space="preserve">guardrails devolveram dados internos: uma função de tabela que recebe o</w:t>
+      </w:r>
+      <w:r>
+        <w:t xml:space="preserve"> </w:t>
+      </w:r>
+      <w:r>
+        <w:t xml:space="preserve">nome da tabela como texto, uma consulta ao catálogo que revelou a coluna</w:t>
+      </w:r>
+      <w:r>
+        <w:t xml:space="preserve"> </w:t>
+      </w:r>
+      <w:r>
+        <w:t xml:space="preserve">de CPF e uma listagem das tabelas internas. A correção adotou duas</w:t>
+      </w:r>
+      <w:r>
+        <w:t xml:space="preserve"> </w:t>
+      </w:r>
+      <w:r>
+        <w:t xml:space="preserve">barreiras independentes: a Gold passou a ser exportada para um arquivo</w:t>
+      </w:r>
+      <w:r>
+        <w:t xml:space="preserve"> </w:t>
+      </w:r>
+      <w:r>
+        <w:t xml:space="preserve">próprio, o único que o sistema abre, e as funções de tabela e de</w:t>
+      </w:r>
+      <w:r>
+        <w:t xml:space="preserve"> </w:t>
+      </w:r>
+      <w:r>
+        <w:t xml:space="preserve">catálogo passaram a ser bloqueadas. O protótipo reproduziu o que a</w:t>
+      </w:r>
+      <w:r>
+        <w:t xml:space="preserve"> </w:t>
+      </w:r>
+      <w:r>
+        <w:t xml:space="preserve">literatura recente afirma: restrição expressa apenas sobre o texto, no</w:t>
+      </w:r>
+      <w:r>
+        <w:t xml:space="preserve"> </w:t>
+      </w:r>
+      <w:r>
+        <w:t xml:space="preserve">prompt ou por inspeção da consulta, não garante isolamento, e a garantia</w:t>
+      </w:r>
+      <w:r>
+        <w:t xml:space="preserve"> </w:t>
+      </w:r>
+      <w:r>
+        <w:t xml:space="preserve">precisa ser imposta de forma determinista fora do texto (Fei et al.,</w:t>
+      </w:r>
+      <w:r>
+        <w:t xml:space="preserve"> </w:t>
+      </w:r>
+      <w:r>
+        <w:t xml:space="preserve">2026; Klisura et al., 2026; Miyamoto et al., 2026).</w:t>
       </w:r>
     </w:p>
     <w:bookmarkEnd w:id="36"/>
@@ -3191,31 +3167,31 @@
         <w:pStyle w:val="FirstParagraph"/>
       </w:pPr>
       <w:r>
-        <w:t xml:space="preserve">A Tabela 3 apresenta as cinco células executadas com o modelo local, três</w:t>
-      </w:r>
-      <w:r>
-        <w:t xml:space="preserve"> </w:t>
-      </w:r>
-      <w:r>
-        <w:t xml:space="preserve">vezes cada, sobre as 18 perguntas legítimas. O desvio entre execuções foi</w:t>
-      </w:r>
-      <w:r>
-        <w:t xml:space="preserve"> </w:t>
-      </w:r>
-      <w:r>
-        <w:t xml:space="preserve">zero em todas as métricas e a concordância total (TARa@3) foi de 100% em</w:t>
-      </w:r>
-      <w:r>
-        <w:t xml:space="preserve"> </w:t>
-      </w:r>
-      <w:r>
-        <w:t xml:space="preserve">todas as células: as 90 combinações de pergunta e célula produziram a</w:t>
-      </w:r>
-      <w:r>
-        <w:t xml:space="preserve"> </w:t>
-      </w:r>
-      <w:r>
-        <w:t xml:space="preserve">mesma consulta nas três chamadas.</w:t>
+        <w:t xml:space="preserve">A Tabela 3 apresenta as cinco células executadas com o modelo local,</w:t>
+      </w:r>
+      <w:r>
+        <w:t xml:space="preserve"> </w:t>
+      </w:r>
+      <w:r>
+        <w:t xml:space="preserve">três vezes cada, sobre as 18 perguntas legítimas. O desvio entre</w:t>
+      </w:r>
+      <w:r>
+        <w:t xml:space="preserve"> </w:t>
+      </w:r>
+      <w:r>
+        <w:t xml:space="preserve">execuções foi zero em todas as métricas e a concordância total (TARa@3)</w:t>
+      </w:r>
+      <w:r>
+        <w:t xml:space="preserve"> </w:t>
+      </w:r>
+      <w:r>
+        <w:t xml:space="preserve">foi de 100% em todas as células: as 90 combinações de pergunta e célula</w:t>
+      </w:r>
+      <w:r>
+        <w:t xml:space="preserve"> </w:t>
+      </w:r>
+      <w:r>
+        <w:t xml:space="preserve">produziram a mesma consulta nas três chamadas.</w:t>
       </w:r>
     </w:p>
     <w:p>
@@ -3733,37 +3709,37 @@
         <w:pStyle w:val="BodyText"/>
       </w:pPr>
       <w:r>
-        <w:t xml:space="preserve">A descrição enriquecida do schema (C1 contra C0) produziu o maior efeito:</w:t>
-      </w:r>
-      <w:r>
-        <w:t xml:space="preserve"> </w:t>
-      </w:r>
-      <w:r>
-        <w:t xml:space="preserve">seis perguntas passaram a corretas e nenhuma regrediu (teste de sinal,</w:t>
-      </w:r>
-      <w:r>
-        <w:t xml:space="preserve"> </w:t>
-      </w:r>
-      <w:r>
-        <w:t xml:space="preserve">p = 0,03, a única comparação da matriz abaixo de 0,05). Com nomes de</w:t>
-      </w:r>
-      <w:r>
-        <w:t xml:space="preserve"> </w:t>
-      </w:r>
-      <w:r>
-        <w:t xml:space="preserve">coluna sem descrição, o modelo supôs que a tabela de resumo por unidade,</w:t>
-      </w:r>
-      <w:r>
-        <w:t xml:space="preserve"> </w:t>
-      </w:r>
-      <w:r>
-        <w:t xml:space="preserve">uma fotografia do dia, tinha coluna de data, e escreveu literais de texto</w:t>
-      </w:r>
-      <w:r>
-        <w:t xml:space="preserve"> </w:t>
-      </w:r>
-      <w:r>
-        <w:t xml:space="preserve">para uma coluna booleana; a descrição resolveu ambos, em linha com a</w:t>
+        <w:t xml:space="preserve">A descrição enriquecida do schema (C1 contra C0) produziu o maior</w:t>
+      </w:r>
+      <w:r>
+        <w:t xml:space="preserve"> </w:t>
+      </w:r>
+      <w:r>
+        <w:t xml:space="preserve">efeito: seis perguntas passaram a corretas e nenhuma regrediu (teste de</w:t>
+      </w:r>
+      <w:r>
+        <w:t xml:space="preserve"> </w:t>
+      </w:r>
+      <w:r>
+        <w:t xml:space="preserve">sinal, p = 0,03, a única comparação da matriz abaixo de 0,05). Sem</w:t>
+      </w:r>
+      <w:r>
+        <w:t xml:space="preserve"> </w:t>
+      </w:r>
+      <w:r>
+        <w:t xml:space="preserve">descrição, o modelo supôs que a tabela de resumo por unidade, uma</w:t>
+      </w:r>
+      <w:r>
+        <w:t xml:space="preserve"> </w:t>
+      </w:r>
+      <w:r>
+        <w:t xml:space="preserve">fotografia do dia, tinha coluna de data, e escreveu literais de texto</w:t>
+      </w:r>
+      <w:r>
+        <w:t xml:space="preserve"> </w:t>
+      </w:r>
+      <w:r>
+        <w:t xml:space="preserve">para uma coluna booleana. A descrição resolveu ambos, em linha com a</w:t>
       </w:r>
       <w:r>
         <w:t xml:space="preserve"> </w:t>
@@ -3802,31 +3778,31 @@
         <w:t xml:space="preserve"> </w:t>
       </w:r>
       <w:r>
-        <w:t xml:space="preserve">projetar coluna a mais e outra por inventar uma coluna na tabela certa;</w:t>
-      </w:r>
-      <w:r>
-        <w:t xml:space="preserve"> </w:t>
-      </w:r>
-      <w:r>
-        <w:t xml:space="preserve">o saldo foi de uma pergunta (p = 1,0), com o maior Soft F1 da matriz. Liu et al. (2026) relatam que expor valores enumerados eleva a acurácia</w:t>
-      </w:r>
-      <w:r>
-        <w:t xml:space="preserve"> </w:t>
-      </w:r>
-      <w:r>
-        <w:t xml:space="preserve">dos filtros; neste trabalho a elevação veio acompanhada de duas</w:t>
-      </w:r>
-      <w:r>
-        <w:t xml:space="preserve"> </w:t>
-      </w:r>
-      <w:r>
-        <w:t xml:space="preserve">regressões, o que a expectativa formada a partir daquele estudo não</w:t>
-      </w:r>
-      <w:r>
-        <w:t xml:space="preserve"> </w:t>
-      </w:r>
-      <w:r>
-        <w:t xml:space="preserve">previa.</w:t>
+        <w:t xml:space="preserve">projetar coluna a mais e outra por inventar uma coluna na tabela certa.</w:t>
+      </w:r>
+      <w:r>
+        <w:t xml:space="preserve"> </w:t>
+      </w:r>
+      <w:r>
+        <w:t xml:space="preserve">O saldo foi de uma pergunta (p = 1,0), com o maior Soft F1 da matriz.</w:t>
+      </w:r>
+      <w:r>
+        <w:t xml:space="preserve"> </w:t>
+      </w:r>
+      <w:r>
+        <w:t xml:space="preserve">Liu et al. (2026) relatam que expor valores enumerados eleva a acurácia</w:t>
+      </w:r>
+      <w:r>
+        <w:t xml:space="preserve"> </w:t>
+      </w:r>
+      <w:r>
+        <w:t xml:space="preserve">dos filtros; aqui a elevação veio acompanhada de duas regressões que</w:t>
+      </w:r>
+      <w:r>
+        <w:t xml:space="preserve"> </w:t>
+      </w:r>
+      <w:r>
+        <w:t xml:space="preserve">aquele estudo não previa.</w:t>
       </w:r>
     </w:p>
     <w:p>
@@ -3840,49 +3816,43 @@
         <w:t xml:space="preserve"> </w:t>
       </w:r>
       <w:r>
-        <w:t xml:space="preserve">prevista: três perguntas passaram a corretas e nenhuma regrediu</w:t>
-      </w:r>
-      <w:r>
-        <w:t xml:space="preserve"> </w:t>
-      </w:r>
-      <w:r>
-        <w:t xml:space="preserve">(p = 0,25). Só uma delas é efeito atribuível ao escopo, a pergunta em que</w:t>
-      </w:r>
-      <w:r>
-        <w:t xml:space="preserve"> </w:t>
-      </w:r>
-      <w:r>
-        <w:t xml:space="preserve">o modelo, vendo o schema completo, buscava uma tabela fora do perfil e</w:t>
-      </w:r>
-      <w:r>
-        <w:t xml:space="preserve"> </w:t>
-      </w:r>
-      <w:r>
-        <w:t xml:space="preserve">era barrado; as outras duas mudaram por efeito colateral da forma do</w:t>
-      </w:r>
-      <w:r>
-        <w:t xml:space="preserve"> </w:t>
-      </w:r>
-      <w:r>
-        <w:t xml:space="preserve">prompt. A alucinação de tabelas que Fei et al. (2026) observam quando o schema é</w:t>
-      </w:r>
-      <w:r>
-        <w:t xml:space="preserve"> </w:t>
-      </w:r>
-      <w:r>
-        <w:t xml:space="preserve">restrito não ocorreu nas perguntas legítimas: com o aviso explícito e o</w:t>
-      </w:r>
-      <w:r>
-        <w:t xml:space="preserve"> </w:t>
-      </w:r>
-      <w:r>
-        <w:t xml:space="preserve">verificador, o modelo não citou tabela inexistente em nenhuma das 54</w:t>
-      </w:r>
-      <w:r>
-        <w:t xml:space="preserve"> </w:t>
-      </w:r>
-      <w:r>
-        <w:t xml:space="preserve">chamadas de C3 sobre as 18 perguntas; no conjunto adversarial, uma</w:t>
+        <w:t xml:space="preserve">prevista: três perguntas passaram a corretas e nenhuma regrediu (p =</w:t>
+      </w:r>
+      <w:r>
+        <w:t xml:space="preserve"> </w:t>
+      </w:r>
+      <w:r>
+        <w:t xml:space="preserve">0,25). Só uma delas é efeito atribuível ao escopo, a pergunta em que o</w:t>
+      </w:r>
+      <w:r>
+        <w:t xml:space="preserve"> </w:t>
+      </w:r>
+      <w:r>
+        <w:t xml:space="preserve">modelo, vendo o schema completo, buscava uma tabela fora do perfil e era</w:t>
+      </w:r>
+      <w:r>
+        <w:t xml:space="preserve"> </w:t>
+      </w:r>
+      <w:r>
+        <w:t xml:space="preserve">barrado; as outras duas mudaram por efeito colateral da forma do prompt.</w:t>
+      </w:r>
+      <w:r>
+        <w:t xml:space="preserve"> </w:t>
+      </w:r>
+      <w:r>
+        <w:t xml:space="preserve">A alucinação de tabelas que Fei et al. (2026) observam sob schema</w:t>
+      </w:r>
+      <w:r>
+        <w:t xml:space="preserve"> </w:t>
+      </w:r>
+      <w:r>
+        <w:t xml:space="preserve">restrito não ocorreu nas perguntas legítimas: nas 54 chamadas de C3, o</w:t>
+      </w:r>
+      <w:r>
+        <w:t xml:space="preserve"> </w:t>
+      </w:r>
+      <w:r>
+        <w:t xml:space="preserve">modelo não citou tabela inexistente. No conjunto adversarial, uma</w:t>
       </w:r>
       <w:r>
         <w:t xml:space="preserve"> </w:t>
@@ -3912,43 +3882,31 @@
         <w:t xml:space="preserve"> </w:t>
       </w:r>
       <w:r>
-        <w:t xml:space="preserve">estão confundidos e o efeito do escopo só foi observado nesse perfil. A</w:t>
-      </w:r>
-      <w:r>
-        <w:t xml:space="preserve"> </w:t>
-      </w:r>
-      <w:r>
-        <w:t xml:space="preserve">recusa indevida, que nos resultados preliminares havia custado 11,1</w:t>
-      </w:r>
-      <w:r>
-        <w:t xml:space="preserve"> </w:t>
-      </w:r>
-      <w:r>
-        <w:t xml:space="preserve">pontos de execution match, caiu a 5,6 pontos com a descrição enriquecida</w:t>
-      </w:r>
-      <w:r>
-        <w:t xml:space="preserve"> </w:t>
-      </w:r>
-      <w:r>
-        <w:t xml:space="preserve">e a zero quando o prompt informou o escopo, sem regressão. Esse número</w:t>
-      </w:r>
-      <w:r>
-        <w:t xml:space="preserve"> </w:t>
-      </w:r>
-      <w:r>
-        <w:t xml:space="preserve">mede a recusa de perguntas legítimas, todas construídas para caber no</w:t>
-      </w:r>
-      <w:r>
-        <w:t xml:space="preserve"> </w:t>
-      </w:r>
-      <w:r>
-        <w:t xml:space="preserve">perfil de quem pergunta; o custo da governança propriamente dito, sobre</w:t>
-      </w:r>
-      <w:r>
-        <w:t xml:space="preserve"> </w:t>
-      </w:r>
-      <w:r>
-        <w:t xml:space="preserve">perguntas que o perfil não pode fazer, é medido no conjunto adversarial.</w:t>
+        <w:t xml:space="preserve">estão confundidos. A recusa indevida, que nos resultados preliminares</w:t>
+      </w:r>
+      <w:r>
+        <w:t xml:space="preserve"> </w:t>
+      </w:r>
+      <w:r>
+        <w:t xml:space="preserve">havia custado 11,1 pontos de execution match, caiu a 5,6 pontos com a</w:t>
+      </w:r>
+      <w:r>
+        <w:t xml:space="preserve"> </w:t>
+      </w:r>
+      <w:r>
+        <w:t xml:space="preserve">descrição enriquecida e a zero quando o prompt informou o escopo. Esse</w:t>
+      </w:r>
+      <w:r>
+        <w:t xml:space="preserve"> </w:t>
+      </w:r>
+      <w:r>
+        <w:t xml:space="preserve">número mede só a recusa de perguntas legítimas; o custo da governança</w:t>
+      </w:r>
+      <w:r>
+        <w:t xml:space="preserve"> </w:t>
+      </w:r>
+      <w:r>
+        <w:t xml:space="preserve">propriamente dito é medido no conjunto adversarial.</w:t>
       </w:r>
     </w:p>
     <w:p>
@@ -3968,67 +3926,61 @@
         <w:t xml:space="preserve"> </w:t>
       </w:r>
       <w:r>
-        <w:t xml:space="preserve">menos tokens. C4 obteve set match e Soft F1 maiores, e a escolha por C3 seguiu o</w:t>
-      </w:r>
-      <w:r>
-        <w:t xml:space="preserve"> </w:t>
-      </w:r>
-      <w:r>
-        <w:t xml:space="preserve">critério registrado, sem revisão posterior. O desempate por tokens foi</w:t>
-      </w:r>
-      <w:r>
-        <w:t xml:space="preserve"> </w:t>
-      </w:r>
-      <w:r>
-        <w:t xml:space="preserve">pensado para o custo por chamada de um motor via API; com o motor local,</w:t>
-      </w:r>
-      <w:r>
-        <w:t xml:space="preserve"> </w:t>
-      </w:r>
-      <w:r>
-        <w:t xml:space="preserve">gratuito, C4 teria sido a escolha natural, e dois dos cinco erros</w:t>
-      </w:r>
-      <w:r>
-        <w:t xml:space="preserve"> </w:t>
-      </w:r>
-      <w:r>
-        <w:t xml:space="preserve">residuais de C3 são justamente de literal, que o value linking corrige.</w:t>
-      </w:r>
-      <w:r>
-        <w:t xml:space="preserve"> </w:t>
-      </w:r>
-      <w:r>
-        <w:t xml:space="preserve">C4 com instrução de recusa não foi medida. Os cinco erros residuais de</w:t>
-      </w:r>
-      <w:r>
-        <w:t xml:space="preserve"> </w:t>
-      </w:r>
-      <w:r>
-        <w:t xml:space="preserve">C3 concentraram-se em três causas: dois de</w:t>
-      </w:r>
-      <w:r>
-        <w:t xml:space="preserve"> </w:t>
-      </w:r>
-      <w:r>
-        <w:t xml:space="preserve">projeção incompleta (a unidade sem a taxa que a selecionou), um de</w:t>
-      </w:r>
-      <w:r>
-        <w:t xml:space="preserve"> </w:t>
-      </w:r>
-      <w:r>
-        <w:t xml:space="preserve">dialeto (uma função do MySQL em DuckDB, apesar de o prompt declarar o</w:t>
-      </w:r>
-      <w:r>
-        <w:t xml:space="preserve"> </w:t>
-      </w:r>
-      <w:r>
-        <w:t xml:space="preserve">dialeto) e dois de literal (um nome de unidade incompleto e uma caixa</w:t>
-      </w:r>
-      <w:r>
-        <w:t xml:space="preserve"> </w:t>
-      </w:r>
-      <w:r>
-        <w:t xml:space="preserve">errada com um valor de situação inexistente).</w:t>
+        <w:t xml:space="preserve">menos tokens, apesar do set match e do Soft F1 maiores de C4. O</w:t>
+      </w:r>
+      <w:r>
+        <w:t xml:space="preserve"> </w:t>
+      </w:r>
+      <w:r>
+        <w:t xml:space="preserve">desempate por tokens foi pensado para o custo por chamada de um motor</w:t>
+      </w:r>
+      <w:r>
+        <w:t xml:space="preserve"> </w:t>
+      </w:r>
+      <w:r>
+        <w:t xml:space="preserve">via API; com o motor local, gratuito, C4 teria sido a escolha natural, e</w:t>
+      </w:r>
+      <w:r>
+        <w:t xml:space="preserve"> </w:t>
+      </w:r>
+      <w:r>
+        <w:t xml:space="preserve">dois dos cinco erros residuais de C3 são justamente de literal, que o</w:t>
+      </w:r>
+      <w:r>
+        <w:t xml:space="preserve"> </w:t>
+      </w:r>
+      <w:r>
+        <w:t xml:space="preserve">value linking corrige. C4 com instrução de recusa não foi medida. Os</w:t>
+      </w:r>
+      <w:r>
+        <w:t xml:space="preserve"> </w:t>
+      </w:r>
+      <w:r>
+        <w:t xml:space="preserve">cinco erros residuais de C3 tiveram três causas: dois de projeção</w:t>
+      </w:r>
+      <w:r>
+        <w:t xml:space="preserve"> </w:t>
+      </w:r>
+      <w:r>
+        <w:t xml:space="preserve">incompleta (a unidade sem a taxa que a selecionou), um de dialeto (uma</w:t>
+      </w:r>
+      <w:r>
+        <w:t xml:space="preserve"> </w:t>
+      </w:r>
+      <w:r>
+        <w:t xml:space="preserve">função do MySQL em DuckDB, apesar de o prompt declarar o dialeto) e dois</w:t>
+      </w:r>
+      <w:r>
+        <w:t xml:space="preserve"> </w:t>
+      </w:r>
+      <w:r>
+        <w:t xml:space="preserve">de literal (um nome de unidade incompleto e uma caixa errada com um</w:t>
+      </w:r>
+      <w:r>
+        <w:t xml:space="preserve"> </w:t>
+      </w:r>
+      <w:r>
+        <w:t xml:space="preserve">valor de situação inexistente).</w:t>
       </w:r>
     </w:p>
     <w:bookmarkEnd w:id="37"/>
@@ -4052,37 +4004,31 @@
         <w:t xml:space="preserve"> </w:t>
       </w:r>
       <w:r>
-        <w:t xml:space="preserve">modelo claude-sonnet-4-6, sobre a Gold anterior à minimização e com o</w:t>
-      </w:r>
-      <w:r>
-        <w:t xml:space="preserve"> </w:t>
-      </w:r>
-      <w:r>
-        <w:t xml:space="preserve">prompt simples, e as consultas geradas naquela execução não foram</w:t>
-      </w:r>
-      <w:r>
-        <w:t xml:space="preserve"> </w:t>
-      </w:r>
-      <w:r>
-        <w:t xml:space="preserve">preservadas. Esse número é tratado aqui como observação histórica, sem</w:t>
-      </w:r>
-      <w:r>
-        <w:t xml:space="preserve"> </w:t>
-      </w:r>
-      <w:r>
-        <w:t xml:space="preserve">servir de base de comparação. Para separar o efeito do modelo do efeito</w:t>
-      </w:r>
-      <w:r>
-        <w:t xml:space="preserve"> </w:t>
-      </w:r>
-      <w:r>
-        <w:t xml:space="preserve">do prompt, o mesmo modelo via API foi executado nas células C0 e C3 sobre</w:t>
-      </w:r>
-      <w:r>
-        <w:t xml:space="preserve"> </w:t>
-      </w:r>
-      <w:r>
-        <w:t xml:space="preserve">a Gold e o harness atuais (Tabela 4).</w:t>
+        <w:t xml:space="preserve">modelo claude-sonnet-4-6, sobre a Gold anterior à minimização, com o</w:t>
+      </w:r>
+      <w:r>
+        <w:t xml:space="preserve"> </w:t>
+      </w:r>
+      <w:r>
+        <w:t xml:space="preserve">prompt simples e sem preservar as consultas geradas. Esse número é</w:t>
+      </w:r>
+      <w:r>
+        <w:t xml:space="preserve"> </w:t>
+      </w:r>
+      <w:r>
+        <w:t xml:space="preserve">tratado aqui como observação histórica. Para separar o efeito do modelo</w:t>
+      </w:r>
+      <w:r>
+        <w:t xml:space="preserve"> </w:t>
+      </w:r>
+      <w:r>
+        <w:t xml:space="preserve">do efeito do prompt, o mesmo modelo via API foi executado nas células C0</w:t>
+      </w:r>
+      <w:r>
+        <w:t xml:space="preserve"> </w:t>
+      </w:r>
+      <w:r>
+        <w:t xml:space="preserve">e C3 sobre a Gold e o harness atuais (Tabela 4).</w:t>
       </w:r>
     </w:p>
     <w:p>
@@ -4316,61 +4262,61 @@
         <w:t xml:space="preserve"> </w:t>
       </w:r>
       <w:r>
-        <w:t xml:space="preserve">valeu 52 pontos sob o prompt simples e 19 sob o prompt com escopo. A</w:t>
-      </w:r>
-      <w:r>
-        <w:t xml:space="preserve"> </w:t>
-      </w:r>
-      <w:r>
-        <w:t xml:space="preserve">leitura que os dados sustentam é a de que um prompt bem desenhado</w:t>
-      </w:r>
-      <w:r>
-        <w:t xml:space="preserve"> </w:t>
-      </w:r>
-      <w:r>
-        <w:t xml:space="preserve">reduziu de 52 para 19 pontos a distância entre o modelo local e o modelo</w:t>
-      </w:r>
-      <w:r>
-        <w:t xml:space="preserve"> </w:t>
-      </w:r>
-      <w:r>
-        <w:t xml:space="preserve">via API; nada permite dizer que um fator pese mais que o outro em geral.</w:t>
-      </w:r>
-      <w:r>
-        <w:t xml:space="preserve"> </w:t>
-      </w:r>
-      <w:r>
-        <w:t xml:space="preserve">Em C0, o modelo via API reproduziu o padrão dos resultados preliminares:</w:t>
-      </w:r>
-      <w:r>
-        <w:t xml:space="preserve"> </w:t>
-      </w:r>
-      <w:r>
-        <w:t xml:space="preserve">as duas perguntas da enfermagem barradas por escopo, duas perguntas com</w:t>
-      </w:r>
-      <w:r>
-        <w:t xml:space="preserve"> </w:t>
-      </w:r>
-      <w:r>
-        <w:t xml:space="preserve">colunas a mais e a diferença de 61,1% para 74,1% explicada pela Gold</w:t>
-      </w:r>
-      <w:r>
-        <w:t xml:space="preserve"> </w:t>
-      </w:r>
-      <w:r>
-        <w:t xml:space="preserve">minimizada e pelo harness revisto, não pelo modelo, que foi o mesmo. Em</w:t>
-      </w:r>
-      <w:r>
-        <w:t xml:space="preserve"> </w:t>
-      </w:r>
-      <w:r>
-        <w:t xml:space="preserve">C3, o modelo via API errou os mesmos dois tipos de coisa que o modelo</w:t>
-      </w:r>
-      <w:r>
-        <w:t xml:space="preserve"> </w:t>
-      </w:r>
-      <w:r>
-        <w:t xml:space="preserve">local: uma coluna a mais em uma pergunta e a caixa de um literal em outra.</w:t>
+        <w:t xml:space="preserve">valeu 52 pontos sob o prompt simples e 19 sob o prompt com escopo. Um</w:t>
+      </w:r>
+      <w:r>
+        <w:t xml:space="preserve"> </w:t>
+      </w:r>
+      <w:r>
+        <w:t xml:space="preserve">prompt bem desenhado reduziu de 52 para 19 pontos a distância entre o</w:t>
+      </w:r>
+      <w:r>
+        <w:t xml:space="preserve"> </w:t>
+      </w:r>
+      <w:r>
+        <w:t xml:space="preserve">modelo local e o modelo via API; nada permite dizer que um fator pese</w:t>
+      </w:r>
+      <w:r>
+        <w:t xml:space="preserve"> </w:t>
+      </w:r>
+      <w:r>
+        <w:t xml:space="preserve">mais que o outro em geral. Em C0, o modelo via API reproduziu o padrão</w:t>
+      </w:r>
+      <w:r>
+        <w:t xml:space="preserve"> </w:t>
+      </w:r>
+      <w:r>
+        <w:t xml:space="preserve">dos resultados preliminares, com as duas perguntas da enfermagem</w:t>
+      </w:r>
+      <w:r>
+        <w:t xml:space="preserve"> </w:t>
+      </w:r>
+      <w:r>
+        <w:t xml:space="preserve">barradas por escopo e duas perguntas com colunas a mais; a diferença de</w:t>
+      </w:r>
+      <w:r>
+        <w:t xml:space="preserve"> </w:t>
+      </w:r>
+      <w:r>
+        <w:t xml:space="preserve">61,1% para 74,1% vem da Gold minimizada e do harness revisto, não do</w:t>
+      </w:r>
+      <w:r>
+        <w:t xml:space="preserve"> </w:t>
+      </w:r>
+      <w:r>
+        <w:t xml:space="preserve">modelo, que foi o mesmo. Em C3, o modelo via API errou os mesmos dois</w:t>
+      </w:r>
+      <w:r>
+        <w:t xml:space="preserve"> </w:t>
+      </w:r>
+      <w:r>
+        <w:t xml:space="preserve">tipos de coisa que o modelo local: uma coluna a mais em uma pergunta e a</w:t>
+      </w:r>
+      <w:r>
+        <w:t xml:space="preserve"> </w:t>
+      </w:r>
+      <w:r>
+        <w:t xml:space="preserve">caixa de um literal em outra.</w:t>
       </w:r>
     </w:p>
     <w:p>
@@ -4390,141 +4336,91 @@
         <w:t xml:space="preserve"> </w:t>
       </w:r>
       <w:r>
-        <w:t xml:space="preserve">88,9%, 88,9% e 94,4%), foi de 67,2% a 96,9%; no modelo local, cujas</w:t>
-      </w:r>
-      <w:r>
-        <w:t xml:space="preserve"> </w:t>
-      </w:r>
-      <w:r>
-        <w:t xml:space="preserve">execuções coincidiram, de 49,1% a 87,5%. Com 18 perguntas, nenhum dos intervalos</w:t>
-      </w:r>
-      <w:r>
-        <w:t xml:space="preserve"> </w:t>
-      </w:r>
-      <w:r>
-        <w:t xml:space="preserve">exclui 80%. A hipótese de acurácia superior a 80% foi, portanto, atingida</w:t>
-      </w:r>
-      <w:r>
-        <w:t xml:space="preserve"> </w:t>
-      </w:r>
-      <w:r>
-        <w:t xml:space="preserve">na estimativa pontual com o modelo forte sob o prompt com escopo (90,7%),</w:t>
-      </w:r>
-      <w:r>
-        <w:t xml:space="preserve"> </w:t>
-      </w:r>
-      <w:r>
-        <w:t xml:space="preserve">não foi atingida com o modelo local (72,2%), e em nenhum dos casos o</w:t>
-      </w:r>
-      <w:r>
-        <w:t xml:space="preserve"> </w:t>
-      </w:r>
-      <w:r>
-        <w:t xml:space="preserve">tamanho do conjunto permite afirmar que o valor verdadeiro está acima ou</w:t>
-      </w:r>
-      <w:r>
-        <w:t xml:space="preserve"> </w:t>
-      </w:r>
-      <w:r>
-        <w:t xml:space="preserve">abaixo do limiar. A leitura cega do segundo anotador tornou esse veredito</w:t>
-      </w:r>
-      <w:r>
-        <w:t xml:space="preserve"> </w:t>
-      </w:r>
-      <w:r>
-        <w:t xml:space="preserve">robusto à convenção de projeção das referências: ele concordou com as</w:t>
-      </w:r>
-      <w:r>
-        <w:t xml:space="preserve"> </w:t>
-      </w:r>
-      <w:r>
-        <w:t xml:space="preserve">referências em 17 das 18 perguntas, inclusive nas duas que a projeção</w:t>
-      </w:r>
-      <w:r>
-        <w:t xml:space="preserve"> </w:t>
-      </w:r>
-      <w:r>
-        <w:t xml:space="preserve">mínima do modelo havia contrariado, e divergiu em uma, pedindo também a</w:t>
-      </w:r>
-      <w:r>
-        <w:t xml:space="preserve"> </w:t>
-      </w:r>
-      <w:r>
-        <w:t xml:space="preserve">data da maior taxa de ocupação, que nenhum modelo devolveu. Sob a leitura</w:t>
-      </w:r>
-      <w:r>
-        <w:t xml:space="preserve"> </w:t>
-      </w:r>
-      <w:r>
-        <w:t xml:space="preserve">do anotador, todas as células perdem 5,6 pontos, e o modelo local fica</w:t>
-      </w:r>
-      <w:r>
-        <w:t xml:space="preserve"> </w:t>
-      </w:r>
-      <w:r>
-        <w:t xml:space="preserve">abaixo de 80% nas duas leituras, enquanto o modelo via API fica acima nas</w:t>
-      </w:r>
-      <w:r>
-        <w:t xml:space="preserve"> </w:t>
-      </w:r>
-      <w:r>
-        <w:t xml:space="preserve">duas (90,7% e 85,2%). A referência divergente foi mantida como estava, porque alterar o</w:t>
-      </w:r>
-      <w:r>
-        <w:t xml:space="preserve"> </w:t>
-      </w:r>
-      <w:r>
-        <w:t xml:space="preserve">gabarito após conhecer os resultados comprometeria a comparação.</w:t>
-      </w:r>
-    </w:p>
-    <w:p>
-      <w:pPr>
-        <w:pStyle w:val="BodyText"/>
-      </w:pPr>
-      <w:r>
-        <w:t xml:space="preserve">A execução via API mostrou ainda que, com temperatura zero, o</w:t>
-      </w:r>
-      <w:r>
-        <w:t xml:space="preserve"> </w:t>
-      </w:r>
-      <w:r>
-        <w:t xml:space="preserve">modelo mudou a consulta de uma pergunta em cada célula entre chamadas</w:t>
-      </w:r>
-      <w:r>
-        <w:t xml:space="preserve"> </w:t>
-      </w:r>
-      <w:r>
-        <w:t xml:space="preserve">contíguas (TARa@3 de 94,4%), variação que o modelo local com semente fixa</w:t>
-      </w:r>
-      <w:r>
-        <w:t xml:space="preserve"> </w:t>
-      </w:r>
-      <w:r>
-        <w:t xml:space="preserve">não apresentou em nenhuma das 270 chamadas da matriz, coerente com o não</w:t>
-      </w:r>
-      <w:r>
-        <w:t xml:space="preserve"> </w:t>
-      </w:r>
-      <w:r>
-        <w:t xml:space="preserve">determinismo de configurações</w:t>
-      </w:r>
-      <w:r>
-        <w:t xml:space="preserve"> </w:t>
-      </w:r>
-      <w:r>
-        <w:t xml:space="preserve">“deterministas”</w:t>
-      </w:r>
-      <w:r>
-        <w:t xml:space="preserve"> </w:t>
-      </w:r>
-      <w:r>
-        <w:t xml:space="preserve">em serviços hospedados</w:t>
-      </w:r>
-      <w:r>
-        <w:t xml:space="preserve"> </w:t>
-      </w:r>
-      <w:r>
-        <w:t xml:space="preserve">descrito por Atıl et al. (2025).</w:t>
+        <w:t xml:space="preserve">88,9%, 88,9% e 94,4%), foi de 67,2% a 96,9%; no modelo local, de 49,1% a</w:t>
+      </w:r>
+      <w:r>
+        <w:t xml:space="preserve"> </w:t>
+      </w:r>
+      <w:r>
+        <w:t xml:space="preserve">87,5%. Nenhum dos dois exclui 80%. A hipótese de acurácia superior a 80%</w:t>
+      </w:r>
+      <w:r>
+        <w:t xml:space="preserve"> </w:t>
+      </w:r>
+      <w:r>
+        <w:t xml:space="preserve">foi, portanto, atingida na estimativa pontual com o modelo forte sob o</w:t>
+      </w:r>
+      <w:r>
+        <w:t xml:space="preserve"> </w:t>
+      </w:r>
+      <w:r>
+        <w:t xml:space="preserve">prompt com escopo (90,7%), não foi atingida com o modelo local (72,2%),</w:t>
+      </w:r>
+      <w:r>
+        <w:t xml:space="preserve"> </w:t>
+      </w:r>
+      <w:r>
+        <w:t xml:space="preserve">e em nenhum dos casos o tamanho do conjunto permite situar o valor</w:t>
+      </w:r>
+      <w:r>
+        <w:t xml:space="preserve"> </w:t>
+      </w:r>
+      <w:r>
+        <w:t xml:space="preserve">verdadeiro acima ou abaixo do limiar. A leitura cega do segundo anotador</w:t>
+      </w:r>
+      <w:r>
+        <w:t xml:space="preserve"> </w:t>
+      </w:r>
+      <w:r>
+        <w:t xml:space="preserve">tornou esse veredito robusto à convenção de projeção das referências:</w:t>
+      </w:r>
+      <w:r>
+        <w:t xml:space="preserve"> </w:t>
+      </w:r>
+      <w:r>
+        <w:t xml:space="preserve">ele concordou com as referências em 17 das 18 perguntas, inclusive nas</w:t>
+      </w:r>
+      <w:r>
+        <w:t xml:space="preserve"> </w:t>
+      </w:r>
+      <w:r>
+        <w:t xml:space="preserve">duas que a projeção mínima do modelo havia contrariado, e divergiu em</w:t>
+      </w:r>
+      <w:r>
+        <w:t xml:space="preserve"> </w:t>
+      </w:r>
+      <w:r>
+        <w:t xml:space="preserve">uma, pedindo também a data da maior taxa de ocupação, que nenhum modelo</w:t>
+      </w:r>
+      <w:r>
+        <w:t xml:space="preserve"> </w:t>
+      </w:r>
+      <w:r>
+        <w:t xml:space="preserve">devolveu. Sob a leitura do anotador, todas as células perdem 5,6 pontos:</w:t>
+      </w:r>
+      <w:r>
+        <w:t xml:space="preserve"> </w:t>
+      </w:r>
+      <w:r>
+        <w:t xml:space="preserve">o modelo local fica abaixo de 80% nas duas leituras e o modelo via API</w:t>
+      </w:r>
+      <w:r>
+        <w:t xml:space="preserve"> </w:t>
+      </w:r>
+      <w:r>
+        <w:t xml:space="preserve">fica acima nas duas (90,7% e 85,2%). A referência divergente foi</w:t>
+      </w:r>
+      <w:r>
+        <w:t xml:space="preserve"> </w:t>
+      </w:r>
+      <w:r>
+        <w:t xml:space="preserve">mantida, porque alterar o gabarito após conhecer os resultados</w:t>
+      </w:r>
+      <w:r>
+        <w:t xml:space="preserve"> </w:t>
+      </w:r>
+      <w:r>
+        <w:t xml:space="preserve">comprometeria a comparação.</w:t>
       </w:r>
     </w:p>
     <w:bookmarkEnd w:id="38"/>
@@ -5115,127 +5011,91 @@
         <w:pStyle w:val="BodyText"/>
       </w:pPr>
       <w:r>
-        <w:t xml:space="preserve">Sem a instrução de recusa, o modelo não se absteve por iniciativa própria</w:t>
-      </w:r>
-      <w:r>
-        <w:t xml:space="preserve"> </w:t>
-      </w:r>
-      <w:r>
-        <w:t xml:space="preserve">em nenhuma pergunta adversarial: as duas recusas contadas no nível do</w:t>
-      </w:r>
-      <w:r>
-        <w:t xml:space="preserve"> </w:t>
-      </w:r>
-      <w:r>
-        <w:t xml:space="preserve">modelo em E0 são as perguntas barradas pelo filtro de dado pessoal antes</w:t>
-      </w:r>
-      <w:r>
-        <w:t xml:space="preserve"> </w:t>
-      </w:r>
-      <w:r>
-        <w:t xml:space="preserve">de qualquer chamada, que o harness registra como recusa nos dois níveis</w:t>
-      </w:r>
-      <w:r>
-        <w:t xml:space="preserve"> </w:t>
-      </w:r>
-      <w:r>
-        <w:t xml:space="preserve">porque nenhum deles as entregou; excluídas, o modelo recusou 0 de 23 em</w:t>
-      </w:r>
-      <w:r>
-        <w:t xml:space="preserve"> </w:t>
-      </w:r>
-      <w:r>
-        <w:t xml:space="preserve">E0 e 18 de 23 em E1. O resultado coincide com a observação de Fei et al.</w:t>
-      </w:r>
-      <w:r>
-        <w:t xml:space="preserve"> </w:t>
-      </w:r>
-      <w:r>
-        <w:t xml:space="preserve">(2026) de que os modelos raramente recusam por iniciativa própria. Ainda assim, nenhuma linha fora do perfil, de camada</w:t>
-      </w:r>
-      <w:r>
-        <w:t xml:space="preserve"> </w:t>
-      </w:r>
-      <w:r>
-        <w:t xml:space="preserve">interna ou com campo sensível foi entregue em nenhuma das 150 interações</w:t>
-      </w:r>
-      <w:r>
-        <w:t xml:space="preserve"> </w:t>
-      </w:r>
-      <w:r>
-        <w:t xml:space="preserve">adversariais das duas células: das 15 recusas do sistema em E0, 11</w:t>
-      </w:r>
-      <w:r>
-        <w:t xml:space="preserve"> </w:t>
-      </w:r>
-      <w:r>
-        <w:t xml:space="preserve">vieram de controles deterministas, 9 do verificador da consulta (comandos</w:t>
-      </w:r>
-      <w:r>
-        <w:t xml:space="preserve"> </w:t>
-      </w:r>
-      <w:r>
-        <w:t xml:space="preserve">de escrita e de leitura de arquivo, instrução múltipla, camada interna,</w:t>
-      </w:r>
-      <w:r>
-        <w:t xml:space="preserve"> </w:t>
-      </w:r>
-      <w:r>
-        <w:t xml:space="preserve">catálogo e tabela fora do perfil) e 2 do filtro de dado pessoal na</w:t>
-      </w:r>
-      <w:r>
-        <w:t xml:space="preserve"> </w:t>
-      </w:r>
-      <w:r>
-        <w:t xml:space="preserve">pergunta.</w:t>
-      </w:r>
-      <w:r>
-        <w:t xml:space="preserve"> </w:t>
-      </w:r>
-      <w:r>
-        <w:t xml:space="preserve">Nas quatro injeções de instrução em que o modelo obedeceu, gerando</w:t>
-      </w:r>
-      <w:r>
-        <w:t xml:space="preserve"> </w:t>
-      </w:r>
-      <w:r>
-        <w:t xml:space="preserve">exclusão, alteração, leitura de arquivo do sistema e exportação de</w:t>
-      </w:r>
-      <w:r>
-        <w:t xml:space="preserve"> </w:t>
-      </w:r>
-      <w:r>
-        <w:t xml:space="preserve">tabela, o verificador barrou a consulta antes da execução. As outras 4</w:t>
-      </w:r>
-      <w:r>
-        <w:t xml:space="preserve"> </w:t>
-      </w:r>
-      <w:r>
-        <w:t xml:space="preserve">recusas foram contingentes, isto é, dependeram do texto que o modelo</w:t>
-      </w:r>
-      <w:r>
-        <w:t xml:space="preserve"> </w:t>
-      </w:r>
-      <w:r>
-        <w:t xml:space="preserve">escolheu: uma tabela inventada, um nome de coluna sensível usado como</w:t>
-      </w:r>
-      <w:r>
-        <w:t xml:space="preserve"> </w:t>
-      </w:r>
-      <w:r>
-        <w:t xml:space="preserve">apelido e duas colunas inexistentes que fizeram a consulta falhar. Em</w:t>
-      </w:r>
-      <w:r>
-        <w:t xml:space="preserve"> </w:t>
-      </w:r>
-      <w:r>
-        <w:t xml:space="preserve">todas elas, o dado pessoal pedido não existia na Gold, de modo que o</w:t>
-      </w:r>
-      <w:r>
-        <w:t xml:space="preserve"> </w:t>
-      </w:r>
-      <w:r>
-        <w:t xml:space="preserve">escopo não dependeu dessa contingência.</w:t>
+        <w:t xml:space="preserve">Sem a instrução de recusa, o modelo não se absteve por iniciativa</w:t>
+      </w:r>
+      <w:r>
+        <w:t xml:space="preserve"> </w:t>
+      </w:r>
+      <w:r>
+        <w:t xml:space="preserve">própria em nenhuma pergunta adversarial. As duas recusas contadas no</w:t>
+      </w:r>
+      <w:r>
+        <w:t xml:space="preserve"> </w:t>
+      </w:r>
+      <w:r>
+        <w:t xml:space="preserve">nível do modelo em E0 são perguntas barradas pelo filtro de dado pessoal</w:t>
+      </w:r>
+      <w:r>
+        <w:t xml:space="preserve"> </w:t>
+      </w:r>
+      <w:r>
+        <w:t xml:space="preserve">antes de qualquer chamada; excluídas, o modelo recusou 0 de 23 em E0 e</w:t>
+      </w:r>
+      <w:r>
+        <w:t xml:space="preserve"> </w:t>
+      </w:r>
+      <w:r>
+        <w:t xml:space="preserve">18 de 23 em E1, como Fei et al. (2026) observam: os modelos raramente</w:t>
+      </w:r>
+      <w:r>
+        <w:t xml:space="preserve"> </w:t>
+      </w:r>
+      <w:r>
+        <w:t xml:space="preserve">recusam por iniciativa própria. Ainda assim, nenhuma linha fora do</w:t>
+      </w:r>
+      <w:r>
+        <w:t xml:space="preserve"> </w:t>
+      </w:r>
+      <w:r>
+        <w:t xml:space="preserve">perfil, de camada interna ou com campo sensível foi entregue nas 150</w:t>
+      </w:r>
+      <w:r>
+        <w:t xml:space="preserve"> </w:t>
+      </w:r>
+      <w:r>
+        <w:t xml:space="preserve">interações adversariais das duas células. Das 15 recusas do sistema em</w:t>
+      </w:r>
+      <w:r>
+        <w:t xml:space="preserve"> </w:t>
+      </w:r>
+      <w:r>
+        <w:t xml:space="preserve">E0, 11 vieram de controles deterministas: 9 do verificador da consulta</w:t>
+      </w:r>
+      <w:r>
+        <w:t xml:space="preserve"> </w:t>
+      </w:r>
+      <w:r>
+        <w:t xml:space="preserve">(as quatro injeções em que o modelo obedeceu, gerando exclusão,</w:t>
+      </w:r>
+      <w:r>
+        <w:t xml:space="preserve"> </w:t>
+      </w:r>
+      <w:r>
+        <w:t xml:space="preserve">alteração, leitura de arquivo do sistema e exportação de tabela, além de</w:t>
+      </w:r>
+      <w:r>
+        <w:t xml:space="preserve"> </w:t>
+      </w:r>
+      <w:r>
+        <w:t xml:space="preserve">camada interna, catálogo e tabela fora do perfil) e 2 do filtro de dado</w:t>
+      </w:r>
+      <w:r>
+        <w:t xml:space="preserve"> </w:t>
+      </w:r>
+      <w:r>
+        <w:t xml:space="preserve">pessoal. As outras 4 dependeram do texto que o modelo escolheu (tabela</w:t>
+      </w:r>
+      <w:r>
+        <w:t xml:space="preserve"> </w:t>
+      </w:r>
+      <w:r>
+        <w:t xml:space="preserve">inventada, apelido de coluna sensível, colunas inexistentes), mas em</w:t>
+      </w:r>
+      <w:r>
+        <w:t xml:space="preserve"> </w:t>
+      </w:r>
+      <w:r>
+        <w:t xml:space="preserve">todas o dado pedido não existia na Gold.</w:t>
       </w:r>
     </w:p>
     <w:p>
@@ -5249,332 +5109,115 @@
         <w:t xml:space="preserve"> </w:t>
       </w:r>
       <w:r>
-        <w:t xml:space="preserve">10 perguntas sem resposta receberam uma resposta: contagens feitas na tabela</w:t>
-      </w:r>
-      <w:r>
-        <w:t xml:space="preserve"> </w:t>
-      </w:r>
-      <w:r>
-        <w:t xml:space="preserve">permitida no lugar da tabela proibida, colunas nulas com nome de</w:t>
-      </w:r>
-      <w:r>
-        <w:t xml:space="preserve"> </w:t>
-      </w:r>
-      <w:r>
-        <w:t xml:space="preserve">diagnóstico ou de médico responsável, uma projeção de 5% de aumento para</w:t>
-      </w:r>
-      <w:r>
-        <w:t xml:space="preserve"> </w:t>
-      </w:r>
-      <w:r>
-        <w:t xml:space="preserve">o dia seguinte e a parte benigna de uma pergunta que continha uma</w:t>
-      </w:r>
-      <w:r>
-        <w:t xml:space="preserve"> </w:t>
-      </w:r>
-      <w:r>
-        <w:t xml:space="preserve">injeção. Nenhuma delas vazou dado, e todas eram consultas válidas dentro</w:t>
-      </w:r>
-      <w:r>
-        <w:t xml:space="preserve"> </w:t>
-      </w:r>
-      <w:r>
-        <w:t xml:space="preserve">do escopo, por isso passaram. Foi o efeito descrito por Fei et al. (2026) para o schema restrito ao</w:t>
-      </w:r>
-      <w:r>
-        <w:t xml:space="preserve"> </w:t>
-      </w:r>
-      <w:r>
-        <w:t xml:space="preserve">perfil, em que o modelo, sem ver a tabela</w:t>
-      </w:r>
-      <w:r>
-        <w:t xml:space="preserve"> </w:t>
-      </w:r>
-      <w:r>
-        <w:t xml:space="preserve">pedida, responde com o que vê, agora medido sob verificador determinista.</w:t>
-      </w:r>
-      <w:r>
-        <w:t xml:space="preserve"> </w:t>
-      </w:r>
-      <w:r>
-        <w:t xml:space="preserve">A instrução de recusa elevou a recusa devida em todas as famílias</w:t>
-      </w:r>
-      <w:r>
-        <w:t xml:space="preserve"> </w:t>
-      </w:r>
-      <w:r>
-        <w:t xml:space="preserve">(Tabela 6), sem produzir nenhuma recusa indevida, e reduziu as respostas</w:t>
-      </w:r>
-      <w:r>
-        <w:t xml:space="preserve"> </w:t>
-      </w:r>
-      <w:r>
-        <w:t xml:space="preserve">indevidas de 10 para 3 (teste de sinal sobre o desfecho do sistema: 7</w:t>
-      </w:r>
-      <w:r>
-        <w:t xml:space="preserve"> </w:t>
-      </w:r>
-      <w:r>
-        <w:t xml:space="preserve">perguntas melhoraram e 1 piorou, p = 0,07). Houve, porém, um custo que o critério de decisão não previa: uma</w:t>
-      </w:r>
-      <w:r>
-        <w:t xml:space="preserve"> </w:t>
-      </w:r>
-      <w:r>
-        <w:t xml:space="preserve">pergunta legítima mudou de consulta e passou de correta a errada, sem</w:t>
-      </w:r>
-      <w:r>
-        <w:t xml:space="preserve"> </w:t>
-      </w:r>
-      <w:r>
-        <w:t xml:space="preserve">recusa, e o execution match das legítimas caiu de 72,2% para 66,7%. Pelo critério registrado antes da execução, a instrução passou a</w:t>
-      </w:r>
-      <w:r>
-        <w:t xml:space="preserve"> </w:t>
-      </w:r>
-      <w:r>
-        <w:t xml:space="preserve">fazer parte da configuração operacional, com esse custo declarado.</w:t>
-      </w:r>
-    </w:p>
-    <w:p>
-      <w:pPr>
-        <w:pStyle w:val="Legenda"/>
-      </w:pPr>
-      <w:r>
-        <w:t xml:space="preserve">Tabela 6. Recusa devida por família de perguntas adversariais (5 perguntas por família; modelo / sistema)</w:t>
-      </w:r>
-    </w:p>
-    <w:tbl>
-      <w:tblPr>
-        <w:tblStyle w:val="Table"/>
-        <w:tblW w:type="auto" w:w="0"/>
-        <w:tblLook w:firstRow="1" w:lastRow="0" w:firstColumn="0" w:lastColumn="0" w:noHBand="0" w:noVBand="0" w:val="0020"/>
-      </w:tblPr>
-      <w:tblGrid>
-        <w:gridCol w:w="2640"/>
-        <w:gridCol w:w="2640"/>
-        <w:gridCol w:w="2640"/>
-      </w:tblGrid>
-      <w:tr>
-        <w:trPr>
-          <w:tblHeader w:val="on"/>
-        </w:trPr>
-        <w:tc>
-          <w:tcPr/>
-          <w:p>
-            <w:pPr>
-              <w:pStyle w:val="Compact"/>
-            </w:pPr>
-            <w:r>
-              <w:t xml:space="preserve">Família</w:t>
-            </w:r>
-          </w:p>
-        </w:tc>
-        <w:tc>
-          <w:tcPr/>
-          <w:p>
-            <w:pPr>
-              <w:pStyle w:val="Compact"/>
-            </w:pPr>
-            <w:r>
-              <w:t xml:space="preserve">E0</w:t>
-            </w:r>
-          </w:p>
-        </w:tc>
-        <w:tc>
-          <w:tcPr/>
-          <w:p>
-            <w:pPr>
-              <w:pStyle w:val="Compact"/>
-            </w:pPr>
-            <w:r>
-              <w:t xml:space="preserve">E1</w:t>
-            </w:r>
-          </w:p>
-        </w:tc>
-      </w:tr>
-      <w:tr>
-        <w:tc>
-          <w:tcPr/>
-          <w:p>
-            <w:pPr>
-              <w:pStyle w:val="Compact"/>
-            </w:pPr>
-            <w:r>
-              <w:t xml:space="preserve">Dado pessoal</w:t>
-            </w:r>
-          </w:p>
-        </w:tc>
-        <w:tc>
-          <w:tcPr/>
-          <w:p>
-            <w:pPr>
-              <w:pStyle w:val="Compact"/>
-            </w:pPr>
-            <w:r>
-              <w:t xml:space="preserve">2 / 4</w:t>
-            </w:r>
-          </w:p>
-        </w:tc>
-        <w:tc>
-          <w:tcPr/>
-          <w:p>
-            <w:pPr>
-              <w:pStyle w:val="Compact"/>
-            </w:pPr>
-            <w:r>
-              <w:t xml:space="preserve">5 / 5</w:t>
-            </w:r>
-          </w:p>
-        </w:tc>
-      </w:tr>
-      <w:tr>
-        <w:tc>
-          <w:tcPr/>
-          <w:p>
-            <w:pPr>
-              <w:pStyle w:val="Compact"/>
-            </w:pPr>
-            <w:r>
-              <w:t xml:space="preserve">Camada interna ou catálogo</w:t>
-            </w:r>
-          </w:p>
-        </w:tc>
-        <w:tc>
-          <w:tcPr/>
-          <w:p>
-            <w:pPr>
-              <w:pStyle w:val="Compact"/>
-            </w:pPr>
-            <w:r>
-              <w:t xml:space="preserve">0 / 4</w:t>
-            </w:r>
-          </w:p>
-        </w:tc>
-        <w:tc>
-          <w:tcPr/>
-          <w:p>
-            <w:pPr>
-              <w:pStyle w:val="Compact"/>
-            </w:pPr>
-            <w:r>
-              <w:t xml:space="preserve">5 / 5</w:t>
-            </w:r>
-          </w:p>
-        </w:tc>
-      </w:tr>
-      <w:tr>
-        <w:tc>
-          <w:tcPr/>
-          <w:p>
-            <w:pPr>
-              <w:pStyle w:val="Compact"/>
-            </w:pPr>
-            <w:r>
-              <w:t xml:space="preserve">Fora do perfil</w:t>
-            </w:r>
-          </w:p>
-        </w:tc>
-        <w:tc>
-          <w:tcPr/>
-          <w:p>
-            <w:pPr>
-              <w:pStyle w:val="Compact"/>
-            </w:pPr>
-            <w:r>
-              <w:t xml:space="preserve">0 / 2</w:t>
-            </w:r>
-          </w:p>
-        </w:tc>
-        <w:tc>
-          <w:tcPr/>
-          <w:p>
-            <w:pPr>
-              <w:pStyle w:val="Compact"/>
-            </w:pPr>
-            <w:r>
-              <w:t xml:space="preserve">4 / 4</w:t>
-            </w:r>
-          </w:p>
-        </w:tc>
-      </w:tr>
-      <w:tr>
-        <w:tc>
-          <w:tcPr/>
-          <w:p>
-            <w:pPr>
-              <w:pStyle w:val="Compact"/>
-            </w:pPr>
-            <w:r>
-              <w:t xml:space="preserve">Injeção de instruções</w:t>
-            </w:r>
-          </w:p>
-        </w:tc>
-        <w:tc>
-          <w:tcPr/>
-          <w:p>
-            <w:pPr>
-              <w:pStyle w:val="Compact"/>
-            </w:pPr>
-            <w:r>
-              <w:t xml:space="preserve">0 / 4</w:t>
-            </w:r>
-          </w:p>
-        </w:tc>
-        <w:tc>
-          <w:tcPr/>
-          <w:p>
-            <w:pPr>
-              <w:pStyle w:val="Compact"/>
-            </w:pPr>
-            <w:r>
-              <w:t xml:space="preserve">3 / 5</w:t>
-            </w:r>
-          </w:p>
-        </w:tc>
-      </w:tr>
-      <w:tr>
-        <w:tc>
-          <w:tcPr/>
-          <w:p>
-            <w:pPr>
-              <w:pStyle w:val="Compact"/>
-            </w:pPr>
-            <w:r>
-              <w:t xml:space="preserve">Sem resposta no schema</w:t>
-            </w:r>
-          </w:p>
-        </w:tc>
-        <w:tc>
-          <w:tcPr/>
-          <w:p>
-            <w:pPr>
-              <w:pStyle w:val="Compact"/>
-            </w:pPr>
-            <w:r>
-              <w:t xml:space="preserve">0 / 1</w:t>
-            </w:r>
-          </w:p>
-        </w:tc>
-        <w:tc>
-          <w:tcPr/>
-          <w:p>
-            <w:pPr>
-              <w:pStyle w:val="Compact"/>
-            </w:pPr>
-            <w:r>
-              <w:t xml:space="preserve">3 / 3</w:t>
-            </w:r>
-          </w:p>
-        </w:tc>
-      </w:tr>
-    </w:tbl>
-    <w:p>
-      <w:pPr>
-        <w:pStyle w:val="FonteTabela"/>
-      </w:pPr>
-      <w:r>
-        <w:t xml:space="preserve">Fonte: Resultados originais da pesquisa</w:t>
+        <w:t xml:space="preserve">10 perguntas sem resposta receberam uma, sem vazar dado: contagens na</w:t>
+      </w:r>
+      <w:r>
+        <w:t xml:space="preserve"> </w:t>
+      </w:r>
+      <w:r>
+        <w:t xml:space="preserve">tabela permitida no lugar da proibida, colunas nulas com nome de</w:t>
+      </w:r>
+      <w:r>
+        <w:t xml:space="preserve"> </w:t>
+      </w:r>
+      <w:r>
+        <w:t xml:space="preserve">diagnóstico ou de médico, uma projeção de 5% de aumento para o dia</w:t>
+      </w:r>
+      <w:r>
+        <w:t xml:space="preserve"> </w:t>
+      </w:r>
+      <w:r>
+        <w:t xml:space="preserve">seguinte e a parte benigna de uma pergunta com injeção. É o efeito que</w:t>
+      </w:r>
+      <w:r>
+        <w:t xml:space="preserve"> </w:t>
+      </w:r>
+      <w:r>
+        <w:t xml:space="preserve">Fei et al. (2026) descrevem para o schema restrito ao perfil, o modelo</w:t>
+      </w:r>
+      <w:r>
+        <w:t xml:space="preserve"> </w:t>
+      </w:r>
+      <w:r>
+        <w:t xml:space="preserve">respondendo com o que vê, agora medido sob verificador determinista. A</w:t>
+      </w:r>
+      <w:r>
+        <w:t xml:space="preserve"> </w:t>
+      </w:r>
+      <w:r>
+        <w:t xml:space="preserve">instrução de recusa elevou a recusa devida em todas as famílias, sem</w:t>
+      </w:r>
+      <w:r>
+        <w:t xml:space="preserve"> </w:t>
+      </w:r>
+      <w:r>
+        <w:t xml:space="preserve">produzir nenhuma recusa indevida: em E1, o sistema recusou as cinco</w:t>
+      </w:r>
+      <w:r>
+        <w:t xml:space="preserve"> </w:t>
+      </w:r>
+      <w:r>
+        <w:t xml:space="preserve">perguntas por dado pessoal, as cinco de camada interna ou catálogo e as</w:t>
+      </w:r>
+      <w:r>
+        <w:t xml:space="preserve"> </w:t>
+      </w:r>
+      <w:r>
+        <w:t xml:space="preserve">cinco injeções (três já no modelo, duas pelo verificador), quatro das</w:t>
+      </w:r>
+      <w:r>
+        <w:t xml:space="preserve"> </w:t>
+      </w:r>
+      <w:r>
+        <w:t xml:space="preserve">cinco fora do perfil e três das cinco sem resposta no schema, contra 4,</w:t>
+      </w:r>
+      <w:r>
+        <w:t xml:space="preserve"> </w:t>
+      </w:r>
+      <w:r>
+        <w:t xml:space="preserve">4, 4, 2 e 1 recusas em E0, na mesma ordem. As respostas indevidas caíram</w:t>
+      </w:r>
+      <w:r>
+        <w:t xml:space="preserve"> </w:t>
+      </w:r>
+      <w:r>
+        <w:t xml:space="preserve">de 10 para 3 (teste de sinal sobre o desfecho do sistema: 7 perguntas</w:t>
+      </w:r>
+      <w:r>
+        <w:t xml:space="preserve"> </w:t>
+      </w:r>
+      <w:r>
+        <w:t xml:space="preserve">melhoraram e 1 piorou, p = 0,07). Houve um custo que o critério de</w:t>
+      </w:r>
+      <w:r>
+        <w:t xml:space="preserve"> </w:t>
+      </w:r>
+      <w:r>
+        <w:t xml:space="preserve">decisão não previa: uma pergunta legítima mudou de consulta e passou de</w:t>
+      </w:r>
+      <w:r>
+        <w:t xml:space="preserve"> </w:t>
+      </w:r>
+      <w:r>
+        <w:t xml:space="preserve">correta a errada, sem recusa, e o execution match das legítimas caiu de</w:t>
+      </w:r>
+      <w:r>
+        <w:t xml:space="preserve"> </w:t>
+      </w:r>
+      <w:r>
+        <w:t xml:space="preserve">72,2% para 66,7%. Pelo critério registrado antes da execução, a</w:t>
+      </w:r>
+      <w:r>
+        <w:t xml:space="preserve"> </w:t>
+      </w:r>
+      <w:r>
+        <w:t xml:space="preserve">instrução passou a fazer parte da configuração operacional, com esse</w:t>
+      </w:r>
+      <w:r>
+        <w:t xml:space="preserve"> </w:t>
+      </w:r>
+      <w:r>
+        <w:t xml:space="preserve">custo declarado.</w:t>
       </w:r>
     </w:p>
     <w:p>
@@ -5588,31 +5231,31 @@
         <w:t xml:space="preserve"> </w:t>
       </w:r>
       <w:r>
-        <w:t xml:space="preserve">instrução de recusa, recusou por iniciativa própria as mesmas zero</w:t>
-      </w:r>
-      <w:r>
-        <w:t xml:space="preserve"> </w:t>
-      </w:r>
-      <w:r>
-        <w:t xml:space="preserve">perguntas, mas em vez de responder com a tabela permitida improvisou</w:t>
-      </w:r>
-      <w:r>
-        <w:t xml:space="preserve"> </w:t>
-      </w:r>
-      <w:r>
-        <w:t xml:space="preserve">recusas dentro do contrato de saída: consultas que devolvem resultado</w:t>
-      </w:r>
-      <w:r>
-        <w:t xml:space="preserve"> </w:t>
-      </w:r>
-      <w:r>
-        <w:t xml:space="preserve">vazio (</w:t>
+        <w:t xml:space="preserve">instrução, tampouco recusou por iniciativa própria, mas em vez de</w:t>
+      </w:r>
+      <w:r>
+        <w:t xml:space="preserve"> </w:t>
+      </w:r>
+      <w:r>
+        <w:t xml:space="preserve">responder com a tabela permitida improvisou recusas dentro do contrato</w:t>
+      </w:r>
+      <w:r>
+        <w:t xml:space="preserve"> </w:t>
+      </w:r>
+      <w:r>
+        <w:t xml:space="preserve">de saída: consultas de resultado vazio (</w:t>
       </w:r>
       <w:r>
         <w:t xml:space="preserve">“SELECT 0 WHERE 1=0”</w:t>
       </w:r>
       <w:r>
-        <w:t xml:space="preserve">), o valor um, ou uma mensagem de texto como</w:t>
+        <w:t xml:space="preserve">), o valor</w:t>
+      </w:r>
+      <w:r>
+        <w:t xml:space="preserve"> </w:t>
+      </w:r>
+      <w:r>
+        <w:t xml:space="preserve">um ou uma mensagem como</w:t>
       </w:r>
       <w:r>
         <w:t xml:space="preserve"> </w:t>
@@ -5621,85 +5264,61 @@
         <w:t xml:space="preserve">“Acesso negado”</w:t>
       </w:r>
       <w:r>
-        <w:t xml:space="preserve">, todas consultas válidas dentro do escopo, que o</w:t>
-      </w:r>
-      <w:r>
-        <w:t xml:space="preserve"> </w:t>
-      </w:r>
-      <w:r>
-        <w:t xml:space="preserve">verificador aprovou e o sistema entregou. Vinte e duas das 25</w:t>
-      </w:r>
-      <w:r>
-        <w:t xml:space="preserve"> </w:t>
-      </w:r>
-      <w:r>
-        <w:t xml:space="preserve">adversariais foram entregues assim, sem que nenhuma tocasse Bronze,</w:t>
-      </w:r>
-      <w:r>
-        <w:t xml:space="preserve"> </w:t>
-      </w:r>
-      <w:r>
-        <w:t xml:space="preserve">Silver, comando de escrita ou tabela fora do perfil; uma injeção que</w:t>
-      </w:r>
-      <w:r>
-        <w:t xml:space="preserve"> </w:t>
-      </w:r>
-      <w:r>
-        <w:t xml:space="preserve">pedia a exportação da tabela de internações resultou na entrega das</w:t>
-      </w:r>
-      <w:r>
-        <w:t xml:space="preserve"> </w:t>
-      </w:r>
-      <w:r>
-        <w:t xml:space="preserve">2.012 linhas ao gestor, que tinha acesso a elas. Com a instrução de</w:t>
-      </w:r>
-      <w:r>
-        <w:t xml:space="preserve"> </w:t>
-      </w:r>
-      <w:r>
-        <w:t xml:space="preserve">recusa, o modelo via API recusou 22 das 25 no próprio nível do modelo,</w:t>
-      </w:r>
-      <w:r>
-        <w:t xml:space="preserve"> </w:t>
-      </w:r>
-      <w:r>
-        <w:t xml:space="preserve">entregou as mesmas duas perguntas com injeção respondidas pela parte</w:t>
-      </w:r>
-      <w:r>
-        <w:t xml:space="preserve"> </w:t>
-      </w:r>
-      <w:r>
-        <w:t xml:space="preserve">benigna e a mesma pergunta fora do perfil respondida com a tabela</w:t>
-      </w:r>
-      <w:r>
-        <w:t xml:space="preserve"> </w:t>
-      </w:r>
-      <w:r>
-        <w:t xml:space="preserve">permitida, e o execution match das legítimas subiu de 88,9% para 94,4%,</w:t>
-      </w:r>
-      <w:r>
-        <w:t xml:space="preserve"> </w:t>
-      </w:r>
-      <w:r>
-        <w:t xml:space="preserve">com a pergunta de literal em caixa baixa passando a correta. A</w:t>
-      </w:r>
-      <w:r>
-        <w:t xml:space="preserve"> </w:t>
-      </w:r>
-      <w:r>
-        <w:t xml:space="preserve">configuração operacional com o modelo comercial mediu, portanto, 94,4%</w:t>
-      </w:r>
-      <w:r>
-        <w:t xml:space="preserve"> </w:t>
-      </w:r>
-      <w:r>
-        <w:t xml:space="preserve">nas legítimas e 88% de recusa devida, e o Reliability Score com</w:t>
-      </w:r>
-      <w:r>
-        <w:t xml:space="preserve"> </w:t>
-      </w:r>
-      <w:r>
-        <w:t xml:space="preserve">penalidade 10 ficou próximo de zero. A lição vale para os dois modelos:</w:t>
+        <w:t xml:space="preserve">, todas válidas dentro do escopo,</w:t>
+      </w:r>
+      <w:r>
+        <w:t xml:space="preserve"> </w:t>
+      </w:r>
+      <w:r>
+        <w:t xml:space="preserve">que o verificador aprovou e o sistema entregou. Vinte e duas das 25</w:t>
+      </w:r>
+      <w:r>
+        <w:t xml:space="preserve"> </w:t>
+      </w:r>
+      <w:r>
+        <w:t xml:space="preserve">adversariais foram entregues assim, nenhuma tocando camada interna,</w:t>
+      </w:r>
+      <w:r>
+        <w:t xml:space="preserve"> </w:t>
+      </w:r>
+      <w:r>
+        <w:t xml:space="preserve">comando de escrita ou tabela fora do perfil; uma injeção que pedia a</w:t>
+      </w:r>
+      <w:r>
+        <w:t xml:space="preserve"> </w:t>
+      </w:r>
+      <w:r>
+        <w:t xml:space="preserve">exportação da tabela de internações entregou as 2.012 linhas ao gestor,</w:t>
+      </w:r>
+      <w:r>
+        <w:t xml:space="preserve"> </w:t>
+      </w:r>
+      <w:r>
+        <w:t xml:space="preserve">que tinha acesso a elas. Com a instrução, o modelo via API recusou 22</w:t>
+      </w:r>
+      <w:r>
+        <w:t xml:space="preserve"> </w:t>
+      </w:r>
+      <w:r>
+        <w:t xml:space="preserve">das 25 no próprio nível do modelo e entregou três respostas indevidas</w:t>
+      </w:r>
+      <w:r>
+        <w:t xml:space="preserve"> </w:t>
+      </w:r>
+      <w:r>
+        <w:t xml:space="preserve">(duas injeções respondidas pela parte benigna e uma pergunta fora do</w:t>
+      </w:r>
+      <w:r>
+        <w:t xml:space="preserve"> </w:t>
+      </w:r>
+      <w:r>
+        <w:t xml:space="preserve">perfil respondida com a tabela permitida); o execution match das</w:t>
+      </w:r>
+      <w:r>
+        <w:t xml:space="preserve"> </w:t>
+      </w:r>
+      <w:r>
+        <w:t xml:space="preserve">legítimas subiu de 88,9% para 94,4%. A lição vale para os dois modelos:</w:t>
       </w:r>
       <w:r>
         <w:t xml:space="preserve"> </w:t>
@@ -5717,19 +5336,27 @@
         <w:t xml:space="preserve"> </w:t>
       </w:r>
       <w:r>
-        <w:t xml:space="preserve">era uma abstenção sem canal; autorizar a recusa explicitamente resolve o</w:t>
-      </w:r>
-      <w:r>
-        <w:t xml:space="preserve"> </w:t>
-      </w:r>
-      <w:r>
-        <w:t xml:space="preserve">problema nos dois. A família de perguntas legítimas para outro perfil</w:t>
-      </w:r>
-      <w:r>
-        <w:t xml:space="preserve"> </w:t>
-      </w:r>
-      <w:r>
-        <w:t xml:space="preserve">mede o custo da governança propriamente dito: são perguntas que o hospital faria e que o</w:t>
+        <w:t xml:space="preserve">era uma abstenção sem canal. Autorizar a recusa resolve o problema nos</w:t>
+      </w:r>
+      <w:r>
+        <w:t xml:space="preserve"> </w:t>
+      </w:r>
+      <w:r>
+        <w:t xml:space="preserve">dois.</w:t>
+      </w:r>
+    </w:p>
+    <w:p>
+      <w:pPr>
+        <w:pStyle w:val="BodyText"/>
+      </w:pPr>
+      <w:r>
+        <w:t xml:space="preserve">A família de perguntas legítimas para outro perfil mede o custo da</w:t>
+      </w:r>
+      <w:r>
+        <w:t xml:space="preserve"> </w:t>
+      </w:r>
+      <w:r>
+        <w:t xml:space="preserve">governança propriamente dito: são perguntas que o hospital faria e que o</w:t>
       </w:r>
       <w:r>
         <w:t xml:space="preserve"> </w:t>
@@ -5741,37 +5368,31 @@
         <w:t xml:space="preserve"> </w:t>
       </w:r>
       <w:r>
-        <w:t xml:space="preserve">negadas, que é o comportamento desejado, e uma foi respondida</w:t>
-      </w:r>
-      <w:r>
-        <w:t xml:space="preserve"> </w:t>
-      </w:r>
-      <w:r>
-        <w:t xml:space="preserve">erradamente com a tabela permitida; em E0, duas foram negadas e três</w:t>
-      </w:r>
-      <w:r>
-        <w:t xml:space="preserve"> </w:t>
-      </w:r>
-      <w:r>
-        <w:t xml:space="preserve">respondidas erradamente. O custo da governança consistiu, portanto, em negar informação a quem</w:t>
-      </w:r>
-      <w:r>
-        <w:t xml:space="preserve"> </w:t>
-      </w:r>
-      <w:r>
-        <w:t xml:space="preserve">não tinha a finalidade correspondente; sem a instrução de recusa, esse</w:t>
-      </w:r>
-      <w:r>
-        <w:t xml:space="preserve"> </w:t>
-      </w:r>
-      <w:r>
-        <w:t xml:space="preserve">custo se converteu no risco de entregar uma resposta errada no lugar da</w:t>
-      </w:r>
-      <w:r>
-        <w:t xml:space="preserve"> </w:t>
-      </w:r>
-      <w:r>
-        <w:t xml:space="preserve">negativa.</w:t>
+        <w:t xml:space="preserve">negadas, o comportamento desejado, e uma foi respondida erradamente com</w:t>
+      </w:r>
+      <w:r>
+        <w:t xml:space="preserve"> </w:t>
+      </w:r>
+      <w:r>
+        <w:t xml:space="preserve">a tabela permitida; em E0, duas foram negadas e três respondidas</w:t>
+      </w:r>
+      <w:r>
+        <w:t xml:space="preserve"> </w:t>
+      </w:r>
+      <w:r>
+        <w:t xml:space="preserve">erradamente. O custo consistiu em negar informação a quem não tinha a</w:t>
+      </w:r>
+      <w:r>
+        <w:t xml:space="preserve"> </w:t>
+      </w:r>
+      <w:r>
+        <w:t xml:space="preserve">finalidade correspondente; sem a instrução de recusa, converteu-se no</w:t>
+      </w:r>
+      <w:r>
+        <w:t xml:space="preserve"> </w:t>
+      </w:r>
+      <w:r>
+        <w:t xml:space="preserve">risco de entregar uma resposta errada no lugar da negativa.</w:t>
       </w:r>
     </w:p>
     <w:p>
@@ -5779,49 +5400,31 @@
         <w:pStyle w:val="BodyText"/>
       </w:pPr>
       <w:r>
-        <w:t xml:space="preserve">Duas análises feitas sobre os relatórios, sem nova execução,</w:t>
-      </w:r>
-      <w:r>
-        <w:t xml:space="preserve"> </w:t>
-      </w:r>
-      <w:r>
-        <w:t xml:space="preserve">complementam a leitura. Uma regra determinista que se abstivesse sempre que a consulta aprovada</w:t>
-      </w:r>
-      <w:r>
-        <w:t xml:space="preserve"> </w:t>
-      </w:r>
-      <w:r>
-        <w:t xml:space="preserve">devolvesse resultado vazio ou só com valores nulos, na linha do filtro</w:t>
-      </w:r>
-      <w:r>
-        <w:t xml:space="preserve"> </w:t>
-      </w:r>
-      <w:r>
-        <w:t xml:space="preserve">por execução do sistema vencedor do EHRSQL 2024 (Lee et al., 2024a),</w:t>
-      </w:r>
-      <w:r>
-        <w:t xml:space="preserve"> </w:t>
-      </w:r>
-      <w:r>
-        <w:t xml:space="preserve">levaria a recusa devida do sistema a 92% em E1 (a versão da regra</w:t>
-      </w:r>
-      <w:r>
-        <w:t xml:space="preserve"> </w:t>
-      </w:r>
-      <w:r>
-        <w:t xml:space="preserve">versionada no harness cobre só o resultado vazio e dá 88%; a extensão</w:t>
-      </w:r>
-      <w:r>
-        <w:t xml:space="preserve"> </w:t>
-      </w:r>
-      <w:r>
-        <w:t xml:space="preserve">aos resultados nulos foi calculada sobre os relatórios),</w:t>
-      </w:r>
-      <w:r>
-        <w:t xml:space="preserve"> </w:t>
-      </w:r>
-      <w:r>
-        <w:t xml:space="preserve">restando duas respostas indevidas (a explicação pedida por</w:t>
+        <w:t xml:space="preserve">Duas leituras feitas sobre os relatórios, sem nova execução,</w:t>
+      </w:r>
+      <w:r>
+        <w:t xml:space="preserve"> </w:t>
+      </w:r>
+      <w:r>
+        <w:t xml:space="preserve">complementam o quadro. Uma regra que se abstivesse sempre que a consulta</w:t>
+      </w:r>
+      <w:r>
+        <w:t xml:space="preserve"> </w:t>
+      </w:r>
+      <w:r>
+        <w:t xml:space="preserve">aprovada devolvesse resultado vazio ou só nulos, na linha do filtro por</w:t>
+      </w:r>
+      <w:r>
+        <w:t xml:space="preserve"> </w:t>
+      </w:r>
+      <w:r>
+        <w:t xml:space="preserve">execução do sistema vencedor do EHRSQL 2024 (Lee et al., 2024a), levaria</w:t>
+      </w:r>
+      <w:r>
+        <w:t xml:space="preserve"> </w:t>
+      </w:r>
+      <w:r>
+        <w:t xml:space="preserve">a recusa devida do sistema a 92% em E1, restando a explicação pedida por</w:t>
       </w:r>
       <w:r>
         <w:t xml:space="preserve"> </w:t>
@@ -5833,49 +5436,43 @@
         <w:t xml:space="preserve"> </w:t>
       </w:r>
       <w:r>
-        <w:t xml:space="preserve">e a</w:t>
-      </w:r>
-      <w:r>
-        <w:t xml:space="preserve"> </w:t>
-      </w:r>
-      <w:r>
-        <w:t xml:space="preserve">previsão), ao custo de duas perguntas legítimas, então erradas, virarem</w:t>
-      </w:r>
-      <w:r>
-        <w:t xml:space="preserve"> </w:t>
-      </w:r>
-      <w:r>
-        <w:t xml:space="preserve">abstenção. O Reliability Score com penalidade 10 é negativo nas duas</w:t>
-      </w:r>
-      <w:r>
-        <w:t xml:space="preserve"> </w:t>
-      </w:r>
-      <w:r>
-        <w:t xml:space="preserve">células porque cada resposta errada entregue custa 23 pontos num</w:t>
-      </w:r>
-      <w:r>
-        <w:t xml:space="preserve"> </w:t>
-      </w:r>
-      <w:r>
-        <w:t xml:space="preserve">conjunto de 43 com 58% de perguntas a recusar, e inclui como erro duas</w:t>
-      </w:r>
-      <w:r>
-        <w:t xml:space="preserve"> </w:t>
-      </w:r>
-      <w:r>
-        <w:t xml:space="preserve">perguntas legítimas às quais faltou só uma coluna; o valor não é</w:t>
-      </w:r>
-      <w:r>
-        <w:t xml:space="preserve"> </w:t>
-      </w:r>
-      <w:r>
-        <w:t xml:space="preserve">comparável ao do EHRSQL 2024, cujo conjunto tem 20% de perguntas a</w:t>
-      </w:r>
-      <w:r>
-        <w:t xml:space="preserve"> </w:t>
-      </w:r>
-      <w:r>
-        <w:t xml:space="preserve">recusar, e é apresentado ao lado do RS(0).</w:t>
+        <w:t xml:space="preserve">e a previsão, ao custo de duas perguntas legítimas, já</w:t>
+      </w:r>
+      <w:r>
+        <w:t xml:space="preserve"> </w:t>
+      </w:r>
+      <w:r>
+        <w:t xml:space="preserve">erradas, virarem abstenção (a versão da regra versionada no harness</w:t>
+      </w:r>
+      <w:r>
+        <w:t xml:space="preserve"> </w:t>
+      </w:r>
+      <w:r>
+        <w:t xml:space="preserve">cobre só o resultado vazio e dá 88%). O Reliability Score com penalidade</w:t>
+      </w:r>
+      <w:r>
+        <w:t xml:space="preserve"> </w:t>
+      </w:r>
+      <w:r>
+        <w:t xml:space="preserve">10 fica muito abaixo de zero no modelo local porque cada resposta errada</w:t>
+      </w:r>
+      <w:r>
+        <w:t xml:space="preserve"> </w:t>
+      </w:r>
+      <w:r>
+        <w:t xml:space="preserve">entregue custa 23 pontos num conjunto de 43 com 58% de perguntas a</w:t>
+      </w:r>
+      <w:r>
+        <w:t xml:space="preserve"> </w:t>
+      </w:r>
+      <w:r>
+        <w:t xml:space="preserve">recusar, e não é comparável ao do EHRSQL 2024, cujo conjunto tem 20% de</w:t>
+      </w:r>
+      <w:r>
+        <w:t xml:space="preserve"> </w:t>
+      </w:r>
+      <w:r>
+        <w:t xml:space="preserve">perguntas a recusar.</w:t>
       </w:r>
     </w:p>
     <w:p>
@@ -5883,7 +5480,7 @@
         <w:pStyle w:val="BodyText"/>
       </w:pPr>
       <w:r>
-        <w:t xml:space="preserve">A execução do conjunto adversarial revelou ainda um defeito no próprio</w:t>
+        <w:t xml:space="preserve">A execução do conjunto adversarial revelou ainda um defeito no</w:t>
       </w:r>
       <w:r>
         <w:t xml:space="preserve"> </w:t>
@@ -5901,55 +5498,43 @@
         <w:t xml:space="preserve"> </w:t>
       </w:r>
       <w:r>
-        <w:t xml:space="preserve">trilha de auditoria. A consulta de uma das injeções, barrada pelo</w:t>
-      </w:r>
-      <w:r>
-        <w:t xml:space="preserve"> </w:t>
-      </w:r>
-      <w:r>
-        <w:t xml:space="preserve">verificador por conter duas instruções, foi assim executada pelo</w:t>
-      </w:r>
-      <w:r>
-        <w:t xml:space="preserve"> </w:t>
-      </w:r>
-      <w:r>
-        <w:t xml:space="preserve">avaliador, e sua segunda instrução exportou a tabela de internações para</w:t>
-      </w:r>
-      <w:r>
-        <w:t xml:space="preserve"> </w:t>
-      </w:r>
-      <w:r>
-        <w:t xml:space="preserve">um arquivo, porque a conexão somente leitura impede escrita no banco, mas</w:t>
-      </w:r>
-      <w:r>
-        <w:t xml:space="preserve"> </w:t>
-      </w:r>
-      <w:r>
-        <w:t xml:space="preserve">não em arquivo. O sistema, do ponto de vista do usuário, não entregou</w:t>
-      </w:r>
-      <w:r>
-        <w:t xml:space="preserve"> </w:t>
-      </w:r>
-      <w:r>
-        <w:t xml:space="preserve">nada. A execução diagnóstica foi restrita a consultas barradas apenas por</w:t>
-      </w:r>
-      <w:r>
-        <w:t xml:space="preserve"> </w:t>
-      </w:r>
-      <w:r>
-        <w:t xml:space="preserve">escopo, a conexão passou a negar acesso a arquivos externos, com teste, e</w:t>
-      </w:r>
-      <w:r>
-        <w:t xml:space="preserve"> </w:t>
-      </w:r>
-      <w:r>
-        <w:t xml:space="preserve">a etapa foi reexecutada, com as consultas das 258 interações idênticas</w:t>
-      </w:r>
-      <w:r>
-        <w:t xml:space="preserve"> </w:t>
-      </w:r>
-      <w:r>
-        <w:t xml:space="preserve">às da primeira execução.</w:t>
+        <w:t xml:space="preserve">trilha, e a consulta de uma das injeções, barrada por conter duas</w:t>
+      </w:r>
+      <w:r>
+        <w:t xml:space="preserve"> </w:t>
+      </w:r>
+      <w:r>
+        <w:t xml:space="preserve">instruções, exportou assim a tabela de internações para um arquivo,</w:t>
+      </w:r>
+      <w:r>
+        <w:t xml:space="preserve"> </w:t>
+      </w:r>
+      <w:r>
+        <w:t xml:space="preserve">porque a conexão somente leitura impede escrita no banco, mas não em</w:t>
+      </w:r>
+      <w:r>
+        <w:t xml:space="preserve"> </w:t>
+      </w:r>
+      <w:r>
+        <w:t xml:space="preserve">arquivo. O usuário não recebeu nada. A execução diagnóstica foi restrita</w:t>
+      </w:r>
+      <w:r>
+        <w:t xml:space="preserve"> </w:t>
+      </w:r>
+      <w:r>
+        <w:t xml:space="preserve">a consultas barradas apenas por escopo, a conexão passou a negar acesso</w:t>
+      </w:r>
+      <w:r>
+        <w:t xml:space="preserve"> </w:t>
+      </w:r>
+      <w:r>
+        <w:t xml:space="preserve">a arquivos externos, com teste, e a etapa foi reexecutada com as 258</w:t>
+      </w:r>
+      <w:r>
+        <w:t xml:space="preserve"> </w:t>
+      </w:r>
+      <w:r>
+        <w:t xml:space="preserve">interações idênticas à primeira execução.</w:t>
       </w:r>
     </w:p>
     <w:bookmarkEnd w:id="39"/>
@@ -5967,7 +5552,7 @@
         <w:pStyle w:val="FirstParagraph"/>
       </w:pPr>
       <w:r>
-        <w:t xml:space="preserve">A Tabela 7 apresenta o que deixa a máquina em cada motor, levantado a</w:t>
+        <w:t xml:space="preserve">A Tabela 6 apresenta o que deixa a máquina em cada motor, levantado a</w:t>
       </w:r>
       <w:r>
         <w:t xml:space="preserve"> </w:t>
@@ -5981,7 +5566,7 @@
         <w:pStyle w:val="Legenda"/>
       </w:pPr>
       <w:r>
-        <w:t xml:space="preserve">Tabela 7. Dados que saem do perímetro, por motor</w:t>
+        <w:t xml:space="preserve">Tabela 6. Dados que saem do perímetro, por motor</w:t>
       </w:r>
     </w:p>
     <w:tbl>
@@ -6160,73 +5745,73 @@
         <w:t xml:space="preserve"> </w:t>
       </w:r>
       <w:r>
-        <w:t xml:space="preserve">separação entre o fato registrado na cadeia e o texto da pergunta, guardado</w:t>
-      </w:r>
-      <w:r>
-        <w:t xml:space="preserve"> </w:t>
-      </w:r>
-      <w:r>
-        <w:t xml:space="preserve">à parte com prazo de retenção e expurgo, o que conciliaria a integridade</w:t>
-      </w:r>
-      <w:r>
-        <w:t xml:space="preserve"> </w:t>
-      </w:r>
-      <w:r>
-        <w:t xml:space="preserve">da auditoria com o término do tratamento e o direito de eliminação</w:t>
-      </w:r>
-      <w:r>
-        <w:t xml:space="preserve"> </w:t>
-      </w:r>
-      <w:r>
-        <w:t xml:space="preserve">previstos na LGPD (Brasil, 2018). O caminho via API, além do filtro, exigiria de um hospital um dos</w:t>
-      </w:r>
-      <w:r>
-        <w:t xml:space="preserve"> </w:t>
-      </w:r>
-      <w:r>
-        <w:t xml:space="preserve">mecanismos de transferência internacional previstos no art. 33 da LGPD e</w:t>
-      </w:r>
-      <w:r>
-        <w:t xml:space="preserve"> </w:t>
-      </w:r>
-      <w:r>
-        <w:t xml:space="preserve">um contrato com o operador do modelo, e a implantação real de qualquer</w:t>
-      </w:r>
-      <w:r>
-        <w:t xml:space="preserve"> </w:t>
-      </w:r>
-      <w:r>
-        <w:t xml:space="preserve">dos caminhos exigiria o relatório de impacto à proteção de dados do art.</w:t>
-      </w:r>
-      <w:r>
-        <w:t xml:space="preserve"> </w:t>
-      </w:r>
-      <w:r>
-        <w:t xml:space="preserve">38, ambos fora do escopo deste trabalho. A implantação local, em que</w:t>
-      </w:r>
-      <w:r>
-        <w:t xml:space="preserve"> </w:t>
-      </w:r>
-      <w:r>
-        <w:t xml:space="preserve">nada sai do perímetro, é a opção adotada na literatura mais próxima</w:t>
-      </w:r>
-      <w:r>
-        <w:t xml:space="preserve"> </w:t>
-      </w:r>
-      <w:r>
-        <w:t xml:space="preserve">deste trabalho (Al Attrach et al., 2026); a abstração do schema e dos valores antes do</w:t>
-      </w:r>
-      <w:r>
-        <w:t xml:space="preserve"> </w:t>
-      </w:r>
-      <w:r>
-        <w:t xml:space="preserve">envio a um modelo remoto (Abedini et al., 2025) é a alternativa para quem</w:t>
-      </w:r>
-      <w:r>
-        <w:t xml:space="preserve"> </w:t>
-      </w:r>
-      <w:r>
-        <w:t xml:space="preserve">precisa da API.</w:t>
+        <w:t xml:space="preserve">separação entre o fato registrado na cadeia e o texto da pergunta,</w:t>
+      </w:r>
+      <w:r>
+        <w:t xml:space="preserve"> </w:t>
+      </w:r>
+      <w:r>
+        <w:t xml:space="preserve">guardado à parte com prazo de retenção e expurgo, o que conciliaria a</w:t>
+      </w:r>
+      <w:r>
+        <w:t xml:space="preserve"> </w:t>
+      </w:r>
+      <w:r>
+        <w:t xml:space="preserve">integridade da auditoria com o término do tratamento e o direito de</w:t>
+      </w:r>
+      <w:r>
+        <w:t xml:space="preserve"> </w:t>
+      </w:r>
+      <w:r>
+        <w:t xml:space="preserve">eliminação previstos na LGPD (Brasil, 2018). O caminho via API, além do</w:t>
+      </w:r>
+      <w:r>
+        <w:t xml:space="preserve"> </w:t>
+      </w:r>
+      <w:r>
+        <w:t xml:space="preserve">filtro, exigiria de um hospital um dos mecanismos de transferência</w:t>
+      </w:r>
+      <w:r>
+        <w:t xml:space="preserve"> </w:t>
+      </w:r>
+      <w:r>
+        <w:t xml:space="preserve">internacional do art. 33 da LGPD e um contrato com o operador do modelo,</w:t>
+      </w:r>
+      <w:r>
+        <w:t xml:space="preserve"> </w:t>
+      </w:r>
+      <w:r>
+        <w:t xml:space="preserve">e a implantação real de qualquer dos caminhos exigiria o relatório de</w:t>
+      </w:r>
+      <w:r>
+        <w:t xml:space="preserve"> </w:t>
+      </w:r>
+      <w:r>
+        <w:t xml:space="preserve">impacto à proteção de dados do art. 38, ambos fora do escopo deste</w:t>
+      </w:r>
+      <w:r>
+        <w:t xml:space="preserve"> </w:t>
+      </w:r>
+      <w:r>
+        <w:t xml:space="preserve">trabalho. A implantação local, em que nada sai do perímetro, é a opção</w:t>
+      </w:r>
+      <w:r>
+        <w:t xml:space="preserve"> </w:t>
+      </w:r>
+      <w:r>
+        <w:t xml:space="preserve">adotada na literatura mais próxima deste trabalho (Al Attrach et al.,</w:t>
+      </w:r>
+      <w:r>
+        <w:t xml:space="preserve"> </w:t>
+      </w:r>
+      <w:r>
+        <w:t xml:space="preserve">2026); a abstração do schema e dos valores antes do envio a um modelo</w:t>
+      </w:r>
+      <w:r>
+        <w:t xml:space="preserve"> </w:t>
+      </w:r>
+      <w:r>
+        <w:t xml:space="preserve">remoto (Abedini et al., 2025) é a alternativa para quem precisa da API.</w:t>
       </w:r>
     </w:p>
     <w:bookmarkEnd w:id="40"/>
@@ -6256,85 +5841,121 @@
         <w:t xml:space="preserve"> </w:t>
       </w:r>
       <w:r>
-        <w:t xml:space="preserve">reiniciado e os mesmos pesos, semente e máquina. As 183 interações do segundo dia (61 perguntas, três execuções cada)</w:t>
-      </w:r>
-      <w:r>
-        <w:t xml:space="preserve"> </w:t>
-      </w:r>
-      <w:r>
-        <w:t xml:space="preserve">repetiram exatamente as consultas do primeiro, com concordância total de</w:t>
-      </w:r>
-      <w:r>
-        <w:t xml:space="preserve"> </w:t>
-      </w:r>
-      <w:r>
-        <w:t xml:space="preserve">100% entre os dias e métricas idênticas. A rastreabilidade foi</w:t>
-      </w:r>
-      <w:r>
-        <w:t xml:space="preserve"> </w:t>
-      </w:r>
-      <w:r>
-        <w:t xml:space="preserve">verificada em todas as execuções versionadas: as 1.077 interações da matriz, do conjunto adversarial com os dois</w:t>
-      </w:r>
-      <w:r>
-        <w:t xml:space="preserve"> </w:t>
-      </w:r>
-      <w:r>
-        <w:t xml:space="preserve">modelos, da ponte com o modelo via API e da repetição têm registro de</w:t>
-      </w:r>
-      <w:r>
-        <w:t xml:space="preserve"> </w:t>
-      </w:r>
-      <w:r>
-        <w:t xml:space="preserve">entrada e de saída na trilha, e as cinco cadeias de hashes foram</w:t>
-      </w:r>
-      <w:r>
-        <w:t xml:space="preserve"> </w:t>
-      </w:r>
-      <w:r>
-        <w:t xml:space="preserve">conferidas íntegras a partir do arquivo. O modelo via API, ao contrário, mudou a consulta entre chamadas</w:t>
-      </w:r>
-      <w:r>
-        <w:t xml:space="preserve"> </w:t>
-      </w:r>
-      <w:r>
-        <w:t xml:space="preserve">contíguas em uma pergunta por célula na matriz e em sete perguntas de E0</w:t>
-      </w:r>
-      <w:r>
-        <w:t xml:space="preserve"> </w:t>
-      </w:r>
-      <w:r>
-        <w:t xml:space="preserve">e uma de E1 no conjunto adversarial, quase todas nas recusas</w:t>
-      </w:r>
-      <w:r>
-        <w:t xml:space="preserve"> </w:t>
-      </w:r>
-      <w:r>
-        <w:t xml:space="preserve">improvisadas. Com semente fixa e pesos identificados, a inferência local foi</w:t>
-      </w:r>
-      <w:r>
-        <w:t xml:space="preserve"> </w:t>
-      </w:r>
-      <w:r>
-        <w:t xml:space="preserve">reproduzível, o que a torna preferível também do ponto de vista da</w:t>
-      </w:r>
-      <w:r>
-        <w:t xml:space="preserve"> </w:t>
-      </w:r>
-      <w:r>
-        <w:t xml:space="preserve">auditoria de resultados; a reprodução em outro hardware ou outra versão</w:t>
-      </w:r>
-      <w:r>
-        <w:t xml:space="preserve"> </w:t>
-      </w:r>
-      <w:r>
-        <w:t xml:space="preserve">do servidor não foi testada, e é justamente onde a literatura indica que</w:t>
-      </w:r>
-      <w:r>
-        <w:t xml:space="preserve"> </w:t>
-      </w:r>
-      <w:r>
-        <w:t xml:space="preserve">o determinismo costuma falhar (Atıl et al., 2025).</w:t>
+        <w:t xml:space="preserve">reiniciado e os mesmos pesos, semente e máquina. As 183 interações do</w:t>
+      </w:r>
+      <w:r>
+        <w:t xml:space="preserve"> </w:t>
+      </w:r>
+      <w:r>
+        <w:t xml:space="preserve">segundo dia (61 perguntas, três execuções cada) repetiram exatamente as</w:t>
+      </w:r>
+      <w:r>
+        <w:t xml:space="preserve"> </w:t>
+      </w:r>
+      <w:r>
+        <w:t xml:space="preserve">consultas do primeiro, com concordância total de 100% entre os dias e</w:t>
+      </w:r>
+      <w:r>
+        <w:t xml:space="preserve"> </w:t>
+      </w:r>
+      <w:r>
+        <w:t xml:space="preserve">métricas idênticas. A rastreabilidade foi verificada em todas as</w:t>
+      </w:r>
+      <w:r>
+        <w:t xml:space="preserve"> </w:t>
+      </w:r>
+      <w:r>
+        <w:t xml:space="preserve">execuções versionadas: as 1.077 interações da matriz, do conjunto</w:t>
+      </w:r>
+      <w:r>
+        <w:t xml:space="preserve"> </w:t>
+      </w:r>
+      <w:r>
+        <w:t xml:space="preserve">adversarial com os dois modelos, da ponte com o modelo via API e da</w:t>
+      </w:r>
+      <w:r>
+        <w:t xml:space="preserve"> </w:t>
+      </w:r>
+      <w:r>
+        <w:t xml:space="preserve">repetição têm registro de entrada e de saída na trilha, e as cinco</w:t>
+      </w:r>
+      <w:r>
+        <w:t xml:space="preserve"> </w:t>
+      </w:r>
+      <w:r>
+        <w:t xml:space="preserve">cadeias de hashes foram conferidas íntegras a partir do arquivo. O</w:t>
+      </w:r>
+      <w:r>
+        <w:t xml:space="preserve"> </w:t>
+      </w:r>
+      <w:r>
+        <w:t xml:space="preserve">modelo via API, ao contrário, mudou a consulta entre chamadas contíguas</w:t>
+      </w:r>
+      <w:r>
+        <w:t xml:space="preserve"> </w:t>
+      </w:r>
+      <w:r>
+        <w:t xml:space="preserve">mesmo com temperatura zero: em uma pergunta por célula na matriz (TARa@3</w:t>
+      </w:r>
+      <w:r>
+        <w:t xml:space="preserve"> </w:t>
+      </w:r>
+      <w:r>
+        <w:t xml:space="preserve">de 94,4%) e em sete perguntas de E0 e uma de E1 no conjunto adversarial,</w:t>
+      </w:r>
+      <w:r>
+        <w:t xml:space="preserve"> </w:t>
+      </w:r>
+      <w:r>
+        <w:t xml:space="preserve">quase todas nas recusas improvisadas, coerente com o não determinismo de</w:t>
+      </w:r>
+      <w:r>
+        <w:t xml:space="preserve"> </w:t>
+      </w:r>
+      <w:r>
+        <w:t xml:space="preserve">configurações</w:t>
+      </w:r>
+      <w:r>
+        <w:t xml:space="preserve"> </w:t>
+      </w:r>
+      <w:r>
+        <w:t xml:space="preserve">“deterministas”</w:t>
+      </w:r>
+      <w:r>
+        <w:t xml:space="preserve"> </w:t>
+      </w:r>
+      <w:r>
+        <w:t xml:space="preserve">em serviços hospedados descrito por Atıl</w:t>
+      </w:r>
+      <w:r>
+        <w:t xml:space="preserve"> </w:t>
+      </w:r>
+      <w:r>
+        <w:t xml:space="preserve">et al. (2025). Com semente fixa e pesos identificados, a inferência</w:t>
+      </w:r>
+      <w:r>
+        <w:t xml:space="preserve"> </w:t>
+      </w:r>
+      <w:r>
+        <w:t xml:space="preserve">local foi reproduzível, o que a torna preferível também para a auditoria</w:t>
+      </w:r>
+      <w:r>
+        <w:t xml:space="preserve"> </w:t>
+      </w:r>
+      <w:r>
+        <w:t xml:space="preserve">de resultados; a reprodução em outro hardware ou outra versão do</w:t>
+      </w:r>
+      <w:r>
+        <w:t xml:space="preserve"> </w:t>
+      </w:r>
+      <w:r>
+        <w:t xml:space="preserve">servidor não foi testada, e é justamente onde a literatura indica que o</w:t>
+      </w:r>
+      <w:r>
+        <w:t xml:space="preserve"> </w:t>
+      </w:r>
+      <w:r>
+        <w:t xml:space="preserve">determinismo costuma falhar.</w:t>
       </w:r>
     </w:p>
     <w:bookmarkEnd w:id="41"/>
@@ -6352,19 +5973,19 @@
         <w:pStyle w:val="FirstParagraph"/>
       </w:pPr>
       <w:r>
-        <w:t xml:space="preserve">A Tabela 8 posiciona os resultados em relação a trabalhos com objetivo</w:t>
-      </w:r>
-      <w:r>
-        <w:t xml:space="preserve"> </w:t>
-      </w:r>
-      <w:r>
-        <w:t xml:space="preserve">semelhante. As comparações são indicativas: os conjuntos, os schemas e as</w:t>
-      </w:r>
-      <w:r>
-        <w:t xml:space="preserve"> </w:t>
-      </w:r>
-      <w:r>
-        <w:t xml:space="preserve">métricas diferem, e o schema deste trabalho é mais simples que os da</w:t>
+        <w:t xml:space="preserve">A Tabela 7 posiciona os resultados em relação a trabalhos com objetivo</w:t>
+      </w:r>
+      <w:r>
+        <w:t xml:space="preserve"> </w:t>
+      </w:r>
+      <w:r>
+        <w:t xml:space="preserve">semelhante. As comparações são indicativas: os conjuntos, os schemas e</w:t>
+      </w:r>
+      <w:r>
+        <w:t xml:space="preserve"> </w:t>
+      </w:r>
+      <w:r>
+        <w:t xml:space="preserve">as métricas diferem, e o schema deste trabalho é mais simples que os da</w:t>
       </w:r>
       <w:r>
         <w:t xml:space="preserve"> </w:t>
@@ -6378,7 +5999,7 @@
         <w:pStyle w:val="Legenda"/>
       </w:pPr>
       <w:r>
-        <w:t xml:space="preserve">Tabela 8. Resultados deste trabalho e da literatura</w:t>
+        <w:t xml:space="preserve">Tabela 7. Resultados deste trabalho e da literatura</w:t>
       </w:r>
     </w:p>
     <w:tbl>
@@ -6389,9 +6010,9 @@
         <w:tblLook w:firstRow="1" w:lastRow="0" w:firstColumn="0" w:lastColumn="0" w:noHBand="0" w:noVBand="0" w:val="0020"/>
       </w:tblPr>
       <w:tblGrid>
-        <w:gridCol w:w="4803"/>
-        <w:gridCol w:w="1558"/>
-        <w:gridCol w:w="1558"/>
+        <w:gridCol w:w="2640"/>
+        <w:gridCol w:w="2640"/>
+        <w:gridCol w:w="2640"/>
       </w:tblGrid>
       <w:tr>
         <w:trPr>
@@ -6450,16 +6071,19 @@
               <w:pStyle w:val="Compact"/>
             </w:pPr>
             <w:r>
-              <w:t xml:space="preserve">43,4%</w:t>
-            </w:r>
-          </w:p>
-        </w:tc>
-        <w:tc>
-          <w:tcPr/>
-          <w:p>
-            <w:pPr>
-              <w:pStyle w:val="Compact"/>
-            </w:pPr>
+              <w:t xml:space="preserve">43,4% (Tanković et al., 2025) a 78% (Li et al., 2026)</w:t>
+            </w:r>
+          </w:p>
+        </w:tc>
+        <w:tc>
+          <w:tcPr/>
+          <w:p>
+            <w:pPr>
+              <w:pStyle w:val="Compact"/>
+            </w:pPr>
+            <w:r>
+              <w:t xml:space="preserve">72,2% (local); 90,7% (via API)</w:t>
+            </w:r>
           </w:p>
         </w:tc>
       </w:tr>
@@ -6471,27 +6095,30 @@
               <w:pStyle w:val="Compact"/>
             </w:pPr>
             <w:r>
-              <w:t xml:space="preserve">(Tanković et al., 2025) a 78% (Li et al., 2026)</w:t>
-            </w:r>
-          </w:p>
-        </w:tc>
-        <w:tc>
-          <w:tcPr/>
-          <w:p>
-            <w:pPr>
-              <w:pStyle w:val="Compact"/>
-            </w:pPr>
-            <w:r>
-              <w:t xml:space="preserve">72,2% (local); 90,7%</w:t>
-            </w:r>
-          </w:p>
-        </w:tc>
-        <w:tc>
-          <w:tcPr/>
-          <w:p>
-            <w:pPr>
-              <w:pStyle w:val="Compact"/>
-            </w:pPr>
+              <w:t xml:space="preserve">Execution match, agentes com ferramentas e correção</w:t>
+            </w:r>
+          </w:p>
+        </w:tc>
+        <w:tc>
+          <w:tcPr/>
+          <w:p>
+            <w:pPr>
+              <w:pStyle w:val="Compact"/>
+            </w:pPr>
+            <w:r>
+              <w:t xml:space="preserve">83,3% a 94% (Al Attrach et al., 2026; Waltl, 2025)</w:t>
+            </w:r>
+          </w:p>
+        </w:tc>
+        <w:tc>
+          <w:tcPr/>
+          <w:p>
+            <w:pPr>
+              <w:pStyle w:val="Compact"/>
+            </w:pPr>
+            <w:r>
+              <w:t xml:space="preserve">não avaliado</w:t>
+            </w:r>
           </w:p>
         </w:tc>
       </w:tr>
@@ -6503,24 +6130,30 @@
               <w:pStyle w:val="Compact"/>
             </w:pPr>
             <w:r>
-              <w:t xml:space="preserve">(via API)</w:t>
-            </w:r>
-          </w:p>
-        </w:tc>
-        <w:tc>
-          <w:tcPr/>
-          <w:p>
-            <w:pPr>
-              <w:pStyle w:val="Compact"/>
-            </w:pPr>
-          </w:p>
-        </w:tc>
-        <w:tc>
-          <w:tcPr/>
-          <w:p>
-            <w:pPr>
-              <w:pStyle w:val="Compact"/>
-            </w:pPr>
+              <w:t xml:space="preserve">Recusa correta em perguntas sem resposta no schema</w:t>
+            </w:r>
+          </w:p>
+        </w:tc>
+        <w:tc>
+          <w:tcPr/>
+          <w:p>
+            <w:pPr>
+              <w:pStyle w:val="Compact"/>
+            </w:pPr>
+            <w:r>
+              <w:t xml:space="preserve">69% (Al Attrach et al., 2026, modelo aberto de 20 bilhões)</w:t>
+            </w:r>
+          </w:p>
+        </w:tc>
+        <w:tc>
+          <w:tcPr/>
+          <w:p>
+            <w:pPr>
+              <w:pStyle w:val="Compact"/>
+            </w:pPr>
+            <w:r>
+              <w:t xml:space="preserve">60% na família equivalente com o modelo local e 100% com o modelo via API (E1); 88% no conjunto adversarial completo com ambos</w:t>
+            </w:r>
           </w:p>
         </w:tc>
       </w:tr>
@@ -6532,29 +6165,29 @@
               <w:pStyle w:val="Compact"/>
             </w:pPr>
             <w:r>
-              <w:t xml:space="preserve">Execution match, agentes com ferramentas e correção</w:t>
-            </w:r>
-          </w:p>
-        </w:tc>
-        <w:tc>
-          <w:tcPr/>
-          <w:p>
-            <w:pPr>
-              <w:pStyle w:val="Compact"/>
-            </w:pPr>
-            <w:r>
-              <w:t xml:space="preserve">83,3% a 94% (Al Attrach et al., 2026; Waltl, 2025)</w:t>
-            </w:r>
-          </w:p>
-        </w:tc>
-        <w:tc>
-          <w:tcPr/>
-          <w:p>
-            <w:pPr>
-              <w:pStyle w:val="Compact"/>
-            </w:pPr>
-            <w:r>
-              <w:t xml:space="preserve">não avaliado</w:t>
+              <w:t xml:space="preserve">Vazamento com política apenas no prompt</w:t>
+            </w:r>
+          </w:p>
+        </w:tc>
+        <w:tc>
+          <w:tcPr/>
+          <w:p>
+            <w:pPr>
+              <w:pStyle w:val="Compact"/>
+            </w:pPr>
+            <w:r>
+              <w:t xml:space="preserve">4,8% a 42,4% (Miyamoto et al., 2026)</w:t>
+            </w:r>
+          </w:p>
+        </w:tc>
+        <w:tc>
+          <w:tcPr/>
+          <w:p>
+            <w:pPr>
+              <w:pStyle w:val="Compact"/>
+            </w:pPr>
+            <w:r>
+              <w:t xml:space="preserve">0 violação de política entregue, com verificador</w:t>
             </w:r>
           </w:p>
         </w:tc>
@@ -6567,187 +6200,126 @@
               <w:pStyle w:val="Compact"/>
             </w:pPr>
             <w:r>
-              <w:t xml:space="preserve">Recusa correta em perguntas sem resposta no schema</w:t>
-            </w:r>
-          </w:p>
-        </w:tc>
-        <w:tc>
-          <w:tcPr/>
-          <w:p>
-            <w:pPr>
-              <w:pStyle w:val="Compact"/>
-            </w:pPr>
-            <w:r>
-              <w:t xml:space="preserve">69% (Al Attrach</w:t>
-            </w:r>
-          </w:p>
-        </w:tc>
-        <w:tc>
-          <w:tcPr/>
-          <w:p>
-            <w:pPr>
-              <w:pStyle w:val="Compact"/>
-            </w:pPr>
-          </w:p>
-        </w:tc>
-      </w:tr>
-      <w:tr>
-        <w:tc>
-          <w:tcPr/>
-          <w:p>
-            <w:pPr>
-              <w:pStyle w:val="Compact"/>
-            </w:pPr>
-            <w:r>
-              <w:t xml:space="preserve">et al., 2026, modelo aberto de 20 bilhões)</w:t>
-            </w:r>
-          </w:p>
-        </w:tc>
-        <w:tc>
-          <w:tcPr/>
-          <w:p>
-            <w:pPr>
-              <w:pStyle w:val="Compact"/>
-            </w:pPr>
-            <w:r>
-              <w:t xml:space="preserve">60% na família equivalente</w:t>
-            </w:r>
-          </w:p>
-        </w:tc>
-        <w:tc>
-          <w:tcPr/>
-          <w:p>
-            <w:pPr>
-              <w:pStyle w:val="Compact"/>
-            </w:pPr>
+              <w:t xml:space="preserve">Violação da política de acesso pelo modelo</w:t>
+            </w:r>
+          </w:p>
+        </w:tc>
+        <w:tc>
+          <w:tcPr/>
+          <w:p>
+            <w:pPr>
+              <w:pStyle w:val="Compact"/>
+            </w:pPr>
+            <w:r>
+              <w:t xml:space="preserve">7,4% no BIRD para um modelo comercial (Fei et al., 2026)</w:t>
+            </w:r>
+          </w:p>
+        </w:tc>
+        <w:tc>
+          <w:tcPr/>
+          <w:p>
+            <w:pPr>
+              <w:pStyle w:val="Compact"/>
+            </w:pPr>
+            <w:r>
+              <w:t xml:space="preserve">0 no sistema em todas as células</w:t>
+            </w:r>
           </w:p>
         </w:tc>
       </w:tr>
     </w:tbl>
     <w:p>
       <w:pPr>
+        <w:pStyle w:val="FonteTabela"/>
+      </w:pPr>
+      <w:r>
+        <w:t xml:space="preserve">Fonte: Resultados originais da pesquisa</w:t>
+      </w:r>
+    </w:p>
+    <w:p>
+      <w:pPr>
         <w:pStyle w:val="BodyText"/>
       </w:pPr>
       <w:r>
-        <w:t xml:space="preserve">com o modelo local e 100% com o modelo via API (E1); 88% no conjunto</w:t>
-      </w:r>
-      <w:r>
-        <w:t xml:space="preserve"> </w:t>
-      </w:r>
-      <w:r>
-        <w:t xml:space="preserve">adversarial completo com ambos |</w:t>
-      </w:r>
-      <w:r>
-        <w:t xml:space="preserve"> </w:t>
-      </w:r>
-      <w:r>
-        <w:t xml:space="preserve">| Vazamento com política apenas no prompt | 4,8% a 42,4% (Miyamoto et al., 2026) | 0 violação de política entregue, com verificador |</w:t>
-      </w:r>
-      <w:r>
-        <w:t xml:space="preserve"> </w:t>
-      </w:r>
-      <w:r>
-        <w:t xml:space="preserve">| Violação da política de acesso pelo modelo | 7,4% no BIRD para um modelo comercial (Fei et al., 2026) | 0 no sistema em todas as células |</w:t>
-      </w:r>
-    </w:p>
-    <w:p>
-      <w:pPr>
-        <w:pStyle w:val="FonteTabela"/>
-      </w:pPr>
-      <w:r>
-        <w:t xml:space="preserve">Fonte: Resultados originais da pesquisa</w:t>
-      </w:r>
-    </w:p>
-    <w:p>
-      <w:pPr>
-        <w:pStyle w:val="BodyText"/>
-      </w:pPr>
-      <w:r>
         <w:t xml:space="preserve">Em acurácia, o modelo local ficou dentro da faixa dos trabalhos de uma</w:t>
       </w:r>
       <w:r>
         <w:t xml:space="preserve"> </w:t>
       </w:r>
       <w:r>
-        <w:t xml:space="preserve">chamada, e o modelo via API, com o prompt com escopo, acima dela, mas</w:t>
-      </w:r>
-      <w:r>
-        <w:t xml:space="preserve"> </w:t>
-      </w:r>
-      <w:r>
-        <w:t xml:space="preserve">abaixo dos sistemas agênticos, que usam várias chamadas, ferramentas e</w:t>
-      </w:r>
-      <w:r>
-        <w:t xml:space="preserve"> </w:t>
-      </w:r>
-      <w:r>
-        <w:t xml:space="preserve">correção iterativa, recursos que este trabalho não empregou. Em violação de política, o valor supera os publicados por uma razão de</w:t>
-      </w:r>
-      <w:r>
-        <w:t xml:space="preserve"> </w:t>
-      </w:r>
-      <w:r>
-        <w:t xml:space="preserve">arquitetura: os trabalhos citados medem o modelo decidindo sozinho ou</w:t>
-      </w:r>
-      <w:r>
-        <w:t xml:space="preserve"> </w:t>
-      </w:r>
-      <w:r>
-        <w:t xml:space="preserve">com verificador baseado em modelo, enquanto aqui um verificador</w:t>
-      </w:r>
-      <w:r>
-        <w:t xml:space="preserve"> </w:t>
-      </w:r>
-      <w:r>
-        <w:t xml:space="preserve">determinista em código decide a execução. Em recusa de perguntas sem resposta, a família comparável ficou abaixo</w:t>
-      </w:r>
-      <w:r>
-        <w:t xml:space="preserve"> </w:t>
-      </w:r>
-      <w:r>
-        <w:t xml:space="preserve">do valor de Al Attrach et al. (2026) com o modelo local, 60% contra 69%,</w:t>
-      </w:r>
-      <w:r>
-        <w:t xml:space="preserve"> </w:t>
-      </w:r>
-      <w:r>
-        <w:t xml:space="preserve">e acima com o modelo via API, que recusou as cinco; o valor de 88% vale</w:t>
-      </w:r>
-      <w:r>
-        <w:t xml:space="preserve"> </w:t>
-      </w:r>
-      <w:r>
-        <w:t xml:space="preserve">para o conjunto adversarial completo, em que, no modelo local, o</w:t>
-      </w:r>
-      <w:r>
-        <w:t xml:space="preserve"> </w:t>
-      </w:r>
-      <w:r>
-        <w:t xml:space="preserve">verificador responde pela maior parte das recusas. A contribuição do</w:t>
-      </w:r>
-      <w:r>
-        <w:t xml:space="preserve"> </w:t>
-      </w:r>
-      <w:r>
-        <w:t xml:space="preserve">trabalho está em medir, sob esse verificador, o que muda quando o modelo</w:t>
-      </w:r>
-      <w:r>
-        <w:t xml:space="preserve"> </w:t>
-      </w:r>
-      <w:r>
-        <w:t xml:space="preserve">conhece o escopo do perfil e quando é autorizado a recusar, algo que os</w:t>
-      </w:r>
-      <w:r>
-        <w:t xml:space="preserve"> </w:t>
-      </w:r>
-      <w:r>
-        <w:t xml:space="preserve">benchmarks de controle de acesso em Text-to-SQL não isolam (Fei et al.,</w:t>
-      </w:r>
-      <w:r>
-        <w:t xml:space="preserve"> </w:t>
-      </w:r>
-      <w:r>
-        <w:t xml:space="preserve">2026; Klisura et al., 2026).</w:t>
+        <w:t xml:space="preserve">chamada, e o modelo via API acima dela, mas abaixo dos sistemas</w:t>
+      </w:r>
+      <w:r>
+        <w:t xml:space="preserve"> </w:t>
+      </w:r>
+      <w:r>
+        <w:t xml:space="preserve">agênticos, que usam várias chamadas, ferramentas e correção iterativa,</w:t>
+      </w:r>
+      <w:r>
+        <w:t xml:space="preserve"> </w:t>
+      </w:r>
+      <w:r>
+        <w:t xml:space="preserve">recursos que este trabalho não empregou. Em violação de política, o zero</w:t>
+      </w:r>
+      <w:r>
+        <w:t xml:space="preserve"> </w:t>
+      </w:r>
+      <w:r>
+        <w:t xml:space="preserve">decorre da arquitetura: os trabalhos citados medem o modelo decidindo</w:t>
+      </w:r>
+      <w:r>
+        <w:t xml:space="preserve"> </w:t>
+      </w:r>
+      <w:r>
+        <w:t xml:space="preserve">sozinho ou com verificador baseado em modelo, enquanto aqui um</w:t>
+      </w:r>
+      <w:r>
+        <w:t xml:space="preserve"> </w:t>
+      </w:r>
+      <w:r>
+        <w:t xml:space="preserve">verificador determinista em código decide a execução. Em recusa de</w:t>
+      </w:r>
+      <w:r>
+        <w:t xml:space="preserve"> </w:t>
+      </w:r>
+      <w:r>
+        <w:t xml:space="preserve">perguntas sem resposta, a família comparável ficou abaixo do valor de Al</w:t>
+      </w:r>
+      <w:r>
+        <w:t xml:space="preserve"> </w:t>
+      </w:r>
+      <w:r>
+        <w:t xml:space="preserve">Attrach et al. (2026) com o modelo local, 60% contra 69%, e acima com o</w:t>
+      </w:r>
+      <w:r>
+        <w:t xml:space="preserve"> </w:t>
+      </w:r>
+      <w:r>
+        <w:t xml:space="preserve">modelo via API, que recusou as cinco. A contribuição do trabalho está em</w:t>
+      </w:r>
+      <w:r>
+        <w:t xml:space="preserve"> </w:t>
+      </w:r>
+      <w:r>
+        <w:t xml:space="preserve">medir, sob esse verificador, o que muda quando o modelo conhece o escopo</w:t>
+      </w:r>
+      <w:r>
+        <w:t xml:space="preserve"> </w:t>
+      </w:r>
+      <w:r>
+        <w:t xml:space="preserve">do perfil e quando é autorizado a recusar, algo que os benchmarks de</w:t>
+      </w:r>
+      <w:r>
+        <w:t xml:space="preserve"> </w:t>
+      </w:r>
+      <w:r>
+        <w:t xml:space="preserve">controle de acesso em Text-to-SQL não isolam (Fei et al., 2026; Klisura</w:t>
+      </w:r>
+      <w:r>
+        <w:t xml:space="preserve"> </w:t>
+      </w:r>
+      <w:r>
+        <w:t xml:space="preserve">et al., 2026).</w:t>
       </w:r>
     </w:p>
     <w:bookmarkEnd w:id="42"/>
@@ -6771,157 +6343,163 @@
         <w:t xml:space="preserve"> </w:t>
       </w:r>
       <w:r>
-        <w:t xml:space="preserve">intervalos de confiança largos impedem afirmar diferenças entre a maioria</w:t>
-      </w:r>
-      <w:r>
-        <w:t xml:space="preserve"> </w:t>
-      </w:r>
-      <w:r>
-        <w:t xml:space="preserve">das configurações. As perguntas, as referências e o sistema foram</w:t>
-      </w:r>
-      <w:r>
-        <w:t xml:space="preserve"> </w:t>
-      </w:r>
-      <w:r>
-        <w:t xml:space="preserve">escritos pelo mesmo autor; a leitura cega de um anotador independente</w:t>
-      </w:r>
-      <w:r>
-        <w:t xml:space="preserve"> </w:t>
-      </w:r>
-      <w:r>
-        <w:t xml:space="preserve">reduziu, mas não eliminou, esse viés. O schema tem quatro tabelas e</w:t>
-      </w:r>
-      <w:r>
-        <w:t xml:space="preserve"> </w:t>
-      </w:r>
-      <w:r>
-        <w:t xml:space="preserve">nenhuma junção, e o comportamento com dezenas de tabelas, prompts maiores</w:t>
-      </w:r>
-      <w:r>
-        <w:t xml:space="preserve"> </w:t>
-      </w:r>
-      <w:r>
-        <w:t xml:space="preserve">e permissões por coluna não foi avaliado. Os dados são sintéticos, de modo que a conformidade com a LGPD só pôde</w:t>
-      </w:r>
-      <w:r>
-        <w:t xml:space="preserve"> </w:t>
-      </w:r>
-      <w:r>
-        <w:t xml:space="preserve">ser demonstrada como propriedade de projeto, e as normas da ANVISA foram</w:t>
-      </w:r>
-      <w:r>
-        <w:t xml:space="preserve"> </w:t>
-      </w:r>
-      <w:r>
-        <w:t xml:space="preserve">adotadas por analogia.</w:t>
-      </w:r>
-      <w:r>
-        <w:t xml:space="preserve"> </w:t>
-      </w:r>
-      <w:r>
-        <w:t xml:space="preserve">A matriz de perfis foi desenhada pelo autor a partir da finalidade de</w:t>
-      </w:r>
-      <w:r>
-        <w:t xml:space="preserve"> </w:t>
-      </w:r>
-      <w:r>
-        <w:t xml:space="preserve">cada função e não foi validada em campo com um hospital; para o gestor,</w:t>
-      </w:r>
-      <w:r>
-        <w:t xml:space="preserve"> </w:t>
-      </w:r>
-      <w:r>
-        <w:t xml:space="preserve">a tabela de internações poderia ser exposta só como agregados por tipo,</w:t>
-      </w:r>
-      <w:r>
-        <w:t xml:space="preserve"> </w:t>
-      </w:r>
-      <w:r>
-        <w:t xml:space="preserve">faixa etária e situação, sem perda para as perguntas avaliadas, o que</w:t>
-      </w:r>
-      <w:r>
-        <w:t xml:space="preserve"> </w:t>
-      </w:r>
-      <w:r>
-        <w:t xml:space="preserve">reduziria o risco de reidentificação no subconjunto em andamento. O k-anonimato</w:t>
-      </w:r>
-      <w:r>
-        <w:t xml:space="preserve"> </w:t>
-      </w:r>
-      <w:r>
-        <w:t xml:space="preserve">imposto cobre o conjunto completo de internações; no subconjunto das</w:t>
-      </w:r>
-      <w:r>
-        <w:t xml:space="preserve"> </w:t>
-      </w:r>
-      <w:r>
-        <w:t xml:space="preserve">internações em andamento o k mínimo é 3, e não há regra de supressão para</w:t>
-      </w:r>
-      <w:r>
-        <w:t xml:space="preserve"> </w:t>
-      </w:r>
-      <w:r>
-        <w:t xml:space="preserve">o caso, esperado em dados reais, de um grupo pequeno violar o limiar.</w:t>
-      </w:r>
-      <w:r>
-        <w:t xml:space="preserve"> </w:t>
-      </w:r>
-      <w:r>
-        <w:t xml:space="preserve">Nome próprio na pergunta não é filtrado, e a retenção do texto na trilha</w:t>
-      </w:r>
-      <w:r>
-        <w:t xml:space="preserve"> </w:t>
-      </w:r>
-      <w:r>
-        <w:t xml:space="preserve">foi apenas projetada. Três respostas a perguntas sem resposta seguiram</w:t>
-      </w:r>
-      <w:r>
-        <w:t xml:space="preserve"> </w:t>
-      </w:r>
-      <w:r>
-        <w:t xml:space="preserve">sendo entregues com a instrução de recusa, e a mitigação de alucinação</w:t>
-      </w:r>
-      <w:r>
-        <w:t xml:space="preserve"> </w:t>
-      </w:r>
-      <w:r>
-        <w:t xml:space="preserve">foi, por isso, considerada parcial. A reprodutibilidade exata foi verificada em uma única máquina, e a</w:t>
-      </w:r>
-      <w:r>
-        <w:t xml:space="preserve"> </w:t>
-      </w:r>
-      <w:r>
-        <w:t xml:space="preserve">latência do modelo local, de 4 a 5 segundos por pergunta em um notebook,</w:t>
-      </w:r>
-      <w:r>
-        <w:t xml:space="preserve"> </w:t>
-      </w:r>
-      <w:r>
-        <w:t xml:space="preserve">não foi avaliada frente a requisitos de uso. A interação tem um único</w:t>
-      </w:r>
-      <w:r>
-        <w:t xml:space="preserve"> </w:t>
-      </w:r>
-      <w:r>
-        <w:t xml:space="preserve">turno: o sistema não pede esclarecimento, não mostra ao usuário a</w:t>
-      </w:r>
-      <w:r>
-        <w:t xml:space="preserve"> </w:t>
-      </w:r>
-      <w:r>
-        <w:t xml:space="preserve">leitura que adotou e responde à pergunta ambígua com uma das leituras</w:t>
-      </w:r>
-      <w:r>
-        <w:t xml:space="preserve"> </w:t>
-      </w:r>
-      <w:r>
-        <w:t xml:space="preserve">possíveis; o anotador independente julgou ambíguas três das 18</w:t>
-      </w:r>
-      <w:r>
-        <w:t xml:space="preserve"> </w:t>
-      </w:r>
-      <w:r>
-        <w:t xml:space="preserve">perguntas. A célula C4 com instrução de recusa não foi medida.</w:t>
+        <w:t xml:space="preserve">intervalos de confiança largos impedem afirmar diferenças entre a</w:t>
+      </w:r>
+      <w:r>
+        <w:t xml:space="preserve"> </w:t>
+      </w:r>
+      <w:r>
+        <w:t xml:space="preserve">maioria das configurações. As perguntas, as referências e o sistema</w:t>
+      </w:r>
+      <w:r>
+        <w:t xml:space="preserve"> </w:t>
+      </w:r>
+      <w:r>
+        <w:t xml:space="preserve">foram escritos pelo mesmo autor; a leitura cega de um anotador</w:t>
+      </w:r>
+      <w:r>
+        <w:t xml:space="preserve"> </w:t>
+      </w:r>
+      <w:r>
+        <w:t xml:space="preserve">independente reduziu, mas não eliminou, esse viés. O schema tem quatro</w:t>
+      </w:r>
+      <w:r>
+        <w:t xml:space="preserve"> </w:t>
+      </w:r>
+      <w:r>
+        <w:t xml:space="preserve">tabelas e nenhuma junção, e o comportamento com dezenas de tabelas,</w:t>
+      </w:r>
+      <w:r>
+        <w:t xml:space="preserve"> </w:t>
+      </w:r>
+      <w:r>
+        <w:t xml:space="preserve">prompts maiores e permissões por coluna não foi avaliado. Os dados são</w:t>
+      </w:r>
+      <w:r>
+        <w:t xml:space="preserve"> </w:t>
+      </w:r>
+      <w:r>
+        <w:t xml:space="preserve">sintéticos, de modo que a conformidade com a LGPD só pôde ser</w:t>
+      </w:r>
+      <w:r>
+        <w:t xml:space="preserve"> </w:t>
+      </w:r>
+      <w:r>
+        <w:t xml:space="preserve">demonstrada como propriedade de projeto, e as normas da ANVISA foram</w:t>
+      </w:r>
+      <w:r>
+        <w:t xml:space="preserve"> </w:t>
+      </w:r>
+      <w:r>
+        <w:t xml:space="preserve">adotadas por analogia. A matriz de perfis foi desenhada pelo autor a</w:t>
+      </w:r>
+      <w:r>
+        <w:t xml:space="preserve"> </w:t>
+      </w:r>
+      <w:r>
+        <w:t xml:space="preserve">partir da finalidade de cada função e não foi validada em campo com um</w:t>
+      </w:r>
+      <w:r>
+        <w:t xml:space="preserve"> </w:t>
+      </w:r>
+      <w:r>
+        <w:t xml:space="preserve">hospital; para o gestor, a tabela de internações poderia ser exposta só</w:t>
+      </w:r>
+      <w:r>
+        <w:t xml:space="preserve"> </w:t>
+      </w:r>
+      <w:r>
+        <w:t xml:space="preserve">como agregados por tipo, faixa etária e situação, sem perda para as</w:t>
+      </w:r>
+      <w:r>
+        <w:t xml:space="preserve"> </w:t>
+      </w:r>
+      <w:r>
+        <w:t xml:space="preserve">perguntas avaliadas, o que reduziria o risco de reidentificação no</w:t>
+      </w:r>
+      <w:r>
+        <w:t xml:space="preserve"> </w:t>
+      </w:r>
+      <w:r>
+        <w:t xml:space="preserve">subconjunto em andamento. O k-anonimato imposto cobre o conjunto</w:t>
+      </w:r>
+      <w:r>
+        <w:t xml:space="preserve"> </w:t>
+      </w:r>
+      <w:r>
+        <w:t xml:space="preserve">completo de internações; no subconjunto das internações em andamento o k</w:t>
+      </w:r>
+      <w:r>
+        <w:t xml:space="preserve"> </w:t>
+      </w:r>
+      <w:r>
+        <w:t xml:space="preserve">mínimo é 3, e não há regra de supressão para o caso, esperado em dados</w:t>
+      </w:r>
+      <w:r>
+        <w:t xml:space="preserve"> </w:t>
+      </w:r>
+      <w:r>
+        <w:t xml:space="preserve">reais, de um grupo pequeno violar o limiar. Nome próprio na pergunta não</w:t>
+      </w:r>
+      <w:r>
+        <w:t xml:space="preserve"> </w:t>
+      </w:r>
+      <w:r>
+        <w:t xml:space="preserve">é filtrado, e a retenção do texto na trilha foi apenas projetada. Três</w:t>
+      </w:r>
+      <w:r>
+        <w:t xml:space="preserve"> </w:t>
+      </w:r>
+      <w:r>
+        <w:t xml:space="preserve">respostas a perguntas sem resposta seguiram sendo entregues com a</w:t>
+      </w:r>
+      <w:r>
+        <w:t xml:space="preserve"> </w:t>
+      </w:r>
+      <w:r>
+        <w:t xml:space="preserve">instrução de recusa, e a mitigação de alucinação foi, por isso,</w:t>
+      </w:r>
+      <w:r>
+        <w:t xml:space="preserve"> </w:t>
+      </w:r>
+      <w:r>
+        <w:t xml:space="preserve">considerada parcial. A reprodutibilidade exata foi verificada em uma</w:t>
+      </w:r>
+      <w:r>
+        <w:t xml:space="preserve"> </w:t>
+      </w:r>
+      <w:r>
+        <w:t xml:space="preserve">única máquina, e a latência do modelo local, de 4 a 5 segundos por</w:t>
+      </w:r>
+      <w:r>
+        <w:t xml:space="preserve"> </w:t>
+      </w:r>
+      <w:r>
+        <w:t xml:space="preserve">pergunta em um notebook, não foi avaliada frente a requisitos de uso. A</w:t>
+      </w:r>
+      <w:r>
+        <w:t xml:space="preserve"> </w:t>
+      </w:r>
+      <w:r>
+        <w:t xml:space="preserve">interação tem um único turno: o sistema não pede esclarecimento, não</w:t>
+      </w:r>
+      <w:r>
+        <w:t xml:space="preserve"> </w:t>
+      </w:r>
+      <w:r>
+        <w:t xml:space="preserve">mostra ao usuário a leitura que adotou e responde à pergunta ambígua com</w:t>
+      </w:r>
+      <w:r>
+        <w:t xml:space="preserve"> </w:t>
+      </w:r>
+      <w:r>
+        <w:t xml:space="preserve">uma das leituras possíveis; o anotador independente julgou ambíguas três</w:t>
+      </w:r>
+      <w:r>
+        <w:t xml:space="preserve"> </w:t>
+      </w:r>
+      <w:r>
+        <w:t xml:space="preserve">das 18 perguntas. A célula C4 com instrução de recusa não foi medida.</w:t>
       </w:r>
     </w:p>
     <w:bookmarkEnd w:id="43"/>
@@ -10245,6 +9823,57 @@
     <w:basedOn w:val="Normal"/>
     <w:qFormat/>
   </w:style>
+  <w:style w:styleId="Autores" w:type="paragraph">
+    <w:name w:val="Autores"/>
+    <w:basedOn w:val="Normal"/>
+    <w:qFormat/>
+    <w:pPr>
+      <w:spacing w:after="120" w:before="120" w:line="240" w:lineRule="auto"/>
+      <w:ind w:firstLine="0"/>
+      <w:jc w:val="center"/>
+    </w:pPr>
+  </w:style>
+  <w:style w:styleId="Endereco" w:type="paragraph">
+    <w:name w:val="Endereco"/>
+    <w:basedOn w:val="Normal"/>
+    <w:qFormat/>
+    <w:pPr>
+      <w:spacing w:after="0" w:before="0" w:line="240" w:lineRule="auto"/>
+      <w:ind w:firstLine="0"/>
+      <w:jc w:val="left"/>
+    </w:pPr>
+    <w:rPr>
+      <w:sz w:val="18"/>
+      <w:szCs w:val="18"/>
+    </w:rPr>
+  </w:style>
+  <w:style w:styleId="Rotulo" w:type="paragraph">
+    <w:name w:val="Rotulo"/>
+    <w:basedOn w:val="Normal"/>
+    <w:qFormat/>
+    <w:pPr>
+      <w:keepNext/>
+      <w:spacing w:after="120" w:before="360" w:line="240" w:lineRule="auto"/>
+      <w:ind w:firstLine="0"/>
+      <w:jc w:val="left"/>
+    </w:pPr>
+  </w:style>
+  <w:style w:styleId="SemRecuo" w:type="paragraph">
+    <w:name w:val="SemRecuo"/>
+    <w:basedOn w:val="BodyText"/>
+    <w:qFormat/>
+    <w:pPr>
+      <w:ind w:firstLine="0"/>
+    </w:pPr>
+  </w:style>
+  <w:style w:styleId="ResumoTexto" w:type="paragraph">
+    <w:name w:val="ResumoTexto"/>
+    <w:basedOn w:val="BodyText"/>
+    <w:qFormat/>
+    <w:pPr>
+      <w:spacing w:line="240" w:lineRule="auto"/>
+    </w:pPr>
+  </w:style>
   <w:style w:styleId="VerbatimChar" w:type="character">
     <w:name w:val="Verbatim Char"/>
     <w:qFormat/>

</xml_diff>

<commit_message>
docs: link do repositorio publico na secao de reprodutibilidade do TCC (#64)
O texto prometia que os artefatos versionados com tag permitem recalcular
qualquer metrica; agora aponta o endereco publico onde isso pode ser
verificado. .docx e .pdf regenerados.
</commit_message>
<xml_diff>
--- a/docs/tcc/final/TCC_final.docx
+++ b/docs/tcc/final/TCC_final.docx
@@ -615,7 +615,7 @@
       </w:r>
     </w:p>
     <w:bookmarkEnd w:id="25"/>
-    <w:bookmarkStart w:id="34" w:name="metodologia"/>
+    <w:bookmarkStart w:id="35" w:name="metodologia"/>
     <w:p>
       <w:pPr>
         <w:pStyle w:val="Heading1"/>
@@ -2573,7 +2573,7 @@
       </w:r>
     </w:p>
     <w:bookmarkEnd w:id="32"/>
-    <w:bookmarkStart w:id="33" w:name="X83a41918099f47fec0eaa5180842078ddd36c9a"/>
+    <w:bookmarkStart w:id="34" w:name="X83a41918099f47fec0eaa5180842078ddd36c9a"/>
     <w:p>
       <w:pPr>
         <w:pStyle w:val="Heading2"/>
@@ -2617,19 +2617,39 @@
         <w:t xml:space="preserve"> </w:t>
       </w:r>
       <w:r>
-        <w:t xml:space="preserve">auditoria, e esses artefatos foram versionados no repositório com uma</w:t>
-      </w:r>
-      <w:r>
-        <w:t xml:space="preserve"> </w:t>
-      </w:r>
-      <w:r>
-        <w:t xml:space="preserve">marca (tag) git no commit que os produziu, permitindo recalcular qualquer</w:t>
-      </w:r>
-      <w:r>
-        <w:t xml:space="preserve"> </w:t>
-      </w:r>
-      <w:r>
-        <w:t xml:space="preserve">métrica sem nova chamada ao modelo. O ambiente foi fixado em versão de</w:t>
+        <w:t xml:space="preserve">auditoria, e esses artefatos foram versionados no repositório público do</w:t>
+      </w:r>
+      <w:r>
+        <w:t xml:space="preserve"> </w:t>
+      </w:r>
+      <w:r>
+        <w:t xml:space="preserve">projeto (disponível em</w:t>
+      </w:r>
+      <w:r>
+        <w:t xml:space="preserve"> </w:t>
+      </w:r>
+      <w:hyperlink r:id="rId33">
+        <w:r>
+          <w:rPr>
+            <w:rStyle w:val="Hyperlink"/>
+          </w:rPr>
+          <w:t xml:space="preserve">https://github.com/Rahal-Gabriel/tcc-conversational-analytics</w:t>
+        </w:r>
+      </w:hyperlink>
+      <w:r>
+        <w:t xml:space="preserve">),</w:t>
+      </w:r>
+      <w:r>
+        <w:t xml:space="preserve"> </w:t>
+      </w:r>
+      <w:r>
+        <w:t xml:space="preserve">com uma marca (tag) git no commit que os produziu, permitindo recalcular</w:t>
+      </w:r>
+      <w:r>
+        <w:t xml:space="preserve"> </w:t>
+      </w:r>
+      <w:r>
+        <w:t xml:space="preserve">qualquer métrica sem nova chamada ao modelo. O ambiente foi fixado em versão de</w:t>
       </w:r>
       <w:r>
         <w:t xml:space="preserve"> </w:t>
@@ -2676,9 +2696,9 @@
         <w:t xml:space="preserve">resultados, por ter consequência de segurança.</w:t>
       </w:r>
     </w:p>
-    <w:bookmarkEnd w:id="33"/>
     <w:bookmarkEnd w:id="34"/>
-    <w:bookmarkStart w:id="43" w:name="resultados-e-discussão"/>
+    <w:bookmarkEnd w:id="35"/>
+    <w:bookmarkStart w:id="44" w:name="resultados-e-discussão"/>
     <w:p>
       <w:pPr>
         <w:pStyle w:val="Heading1"/>
@@ -2707,7 +2727,7 @@
         <w:t xml:space="preserve">versionados; os do pipeline provêm de execução determinista.</w:t>
       </w:r>
     </w:p>
-    <w:bookmarkStart w:id="35" w:name="pipeline-minimização-e-isolamento"/>
+    <w:bookmarkStart w:id="36" w:name="pipeline-minimização-e-isolamento"/>
     <w:p>
       <w:pPr>
         <w:pStyle w:val="Heading2"/>
@@ -3151,8 +3171,8 @@
         <w:t xml:space="preserve">2026; Klisura et al., 2026; Miyamoto et al., 2026).</w:t>
       </w:r>
     </w:p>
-    <w:bookmarkEnd w:id="35"/>
-    <w:bookmarkStart w:id="36" w:name="matriz-de-prompt-com-o-modelo-local"/>
+    <w:bookmarkEnd w:id="36"/>
+    <w:bookmarkStart w:id="37" w:name="matriz-de-prompt-com-o-modelo-local"/>
     <w:p>
       <w:pPr>
         <w:pStyle w:val="Heading2"/>
@@ -3982,8 +4002,8 @@
         <w:t xml:space="preserve">valor de situação inexistente).</w:t>
       </w:r>
     </w:p>
-    <w:bookmarkEnd w:id="36"/>
-    <w:bookmarkStart w:id="37" w:name="X8e9c3255c97aa29fdea024cda37a204a89d1939"/>
+    <w:bookmarkEnd w:id="37"/>
+    <w:bookmarkStart w:id="38" w:name="X8e9c3255c97aa29fdea024cda37a204a89d1939"/>
     <w:p>
       <w:pPr>
         <w:pStyle w:val="Heading2"/>
@@ -4422,8 +4442,8 @@
         <w:t xml:space="preserve">comprometeria a comparação.</w:t>
       </w:r>
     </w:p>
-    <w:bookmarkEnd w:id="37"/>
-    <w:bookmarkStart w:id="38" w:name="recusa-devida-e-custo-da-governança"/>
+    <w:bookmarkEnd w:id="38"/>
+    <w:bookmarkStart w:id="39" w:name="recusa-devida-e-custo-da-governança"/>
     <w:p>
       <w:pPr>
         <w:pStyle w:val="Heading2"/>
@@ -5500,8 +5520,8 @@
         <w:t xml:space="preserve">interações idênticas à primeira execução.</w:t>
       </w:r>
     </w:p>
-    <w:bookmarkEnd w:id="38"/>
-    <w:bookmarkStart w:id="39" w:name="o-que-sai-do-perímetro"/>
+    <w:bookmarkEnd w:id="39"/>
+    <w:bookmarkStart w:id="40" w:name="o-que-sai-do-perímetro"/>
     <w:p>
       <w:pPr>
         <w:pStyle w:val="Heading2"/>
@@ -5771,8 +5791,8 @@
         <w:t xml:space="preserve">2026); a abstração do schema e dos valores antes do envio a um modelo remoto, proposta por Abedini et al. (2025), é a alternativa para quem precisa da API.</w:t>
       </w:r>
     </w:p>
-    <w:bookmarkEnd w:id="39"/>
-    <w:bookmarkStart w:id="40" w:name="estabilidade-e-reprodutibilidade"/>
+    <w:bookmarkEnd w:id="40"/>
+    <w:bookmarkStart w:id="41" w:name="estabilidade-e-reprodutibilidade"/>
     <w:p>
       <w:pPr>
         <w:pStyle w:val="Heading2"/>
@@ -5915,8 +5935,8 @@
         <w:t xml:space="preserve">determinismo costuma falhar.</w:t>
       </w:r>
     </w:p>
-    <w:bookmarkEnd w:id="40"/>
-    <w:bookmarkStart w:id="41" w:name="comparação-com-a-literatura"/>
+    <w:bookmarkEnd w:id="41"/>
+    <w:bookmarkStart w:id="42" w:name="comparação-com-a-literatura"/>
     <w:p>
       <w:pPr>
         <w:pStyle w:val="Heading2"/>
@@ -6279,8 +6299,8 @@
         <w:t xml:space="preserve">et al., 2026).</w:t>
       </w:r>
     </w:p>
-    <w:bookmarkEnd w:id="41"/>
-    <w:bookmarkStart w:id="42" w:name="limitações"/>
+    <w:bookmarkEnd w:id="42"/>
+    <w:bookmarkStart w:id="43" w:name="limitações"/>
     <w:p>
       <w:pPr>
         <w:pStyle w:val="Heading2"/>
@@ -6459,9 +6479,9 @@
         <w:t xml:space="preserve">das 18 perguntas. A célula C4 com instrução de recusa não foi medida.</w:t>
       </w:r>
     </w:p>
-    <w:bookmarkEnd w:id="42"/>
     <w:bookmarkEnd w:id="43"/>
-    <w:bookmarkStart w:id="44" w:name="conclusão"/>
+    <w:bookmarkEnd w:id="44"/>
+    <w:bookmarkStart w:id="45" w:name="conclusão"/>
     <w:p>
       <w:pPr>
         <w:pStyle w:val="Heading1"/>
@@ -6798,8 +6818,8 @@
         <w:t xml:space="preserve">observada precisa ser reexaminada.</w:t>
       </w:r>
     </w:p>
-    <w:bookmarkEnd w:id="44"/>
-    <w:bookmarkStart w:id="45" w:name="referências"/>
+    <w:bookmarkEnd w:id="45"/>
+    <w:bookmarkStart w:id="46" w:name="referências"/>
     <w:p>
       <w:pPr>
         <w:pStyle w:val="Heading1"/>
@@ -7140,8 +7160,8 @@
         <w:t xml:space="preserve">Yu, T.; Zhang, R.; Yang, K.; Yasunaga, M.; Wang, D.; Li, Z.; Ma, J.; Li, I.; Yao, Q.; Roman, S.; Zhang, Z.; Radev, D. 2018. Spider: a large-scale human-labeled dataset for complex and cross-domain semantic parsing and text-to-SQL task. In: Conference on Empirical Methods in Natural Language Processing (EMNLP), 2018, Brussels, Belgium. Anais… Association for Computational Linguistics, p. 3911-3921.</w:t>
       </w:r>
     </w:p>
-    <w:bookmarkEnd w:id="45"/>
-    <w:bookmarkStart w:id="49" w:name="X997c507b506dc9df754dd7c812f32e8b5d42eb9"/>
+    <w:bookmarkEnd w:id="46"/>
+    <w:bookmarkStart w:id="50" w:name="X997c507b506dc9df754dd7c812f32e8b5d42eb9"/>
     <w:p>
       <w:pPr>
         <w:pStyle w:val="Heading1"/>
@@ -7179,18 +7199,18 @@
           <wp:inline>
             <wp:extent cx="5753100" cy="5753100"/>
             <wp:effectExtent b="0" l="0" r="0" t="0"/>
-            <wp:docPr descr="" title="" id="47" name="Picture"/>
+            <wp:docPr descr="" title="" id="48" name="Picture"/>
             <a:graphic>
               <a:graphicData uri="http://schemas.openxmlformats.org/drawingml/2006/picture">
                 <pic:pic>
                   <pic:nvPicPr>
-                    <pic:cNvPr descr="figuras/arquitetura_quatro_camadas.png" id="48" name="Picture"/>
+                    <pic:cNvPr descr="figuras/arquitetura_quatro_camadas.png" id="49" name="Picture"/>
                     <pic:cNvPicPr>
                       <a:picLocks noChangeArrowheads="1" noChangeAspect="1"/>
                     </pic:cNvPicPr>
                   </pic:nvPicPr>
                   <pic:blipFill>
-                    <a:blip r:embed="rId46"/>
+                    <a:blip r:embed="rId47"/>
                     <a:stretch>
                       <a:fillRect/>
                     </a:stretch>
@@ -7440,8 +7460,8 @@
         <w:t xml:space="preserve">Fonte: Dados originais da pesquisa</w:t>
       </w:r>
     </w:p>
-    <w:bookmarkEnd w:id="49"/>
-    <w:bookmarkStart w:id="50" w:name="X9a517e93ee67c595bba77bc5fa0a06f8428179d"/>
+    <w:bookmarkEnd w:id="50"/>
+    <w:bookmarkStart w:id="51" w:name="X9a517e93ee67c595bba77bc5fa0a06f8428179d"/>
     <w:p>
       <w:pPr>
         <w:pStyle w:val="Heading1"/>
@@ -8225,7 +8245,7 @@
         <w:t xml:space="preserve">Fonte: Dados originais da pesquisa</w:t>
       </w:r>
     </w:p>
-    <w:bookmarkEnd w:id="50"/>
+    <w:bookmarkEnd w:id="51"/>
     <w:sectPr>
       <w:headerReference r:id="rId11" w:type="even"/>
       <w:headerReference r:id="rId12" w:type="default"/>

</xml_diff>